<commit_message>
Add remaining camp_mgmt module documentation
</commit_message>
<xml_diff>
--- a/SLCM/camp_mgmt/00-overview.docx
+++ b/SLCM/camp_mgmt/00-overview.docx
@@ -2,7 +2,7 @@
 <file path=word/document.xml><?xml version="1.0" encoding="utf-8"?>
 <w:document xmlns:w="http://schemas.openxmlformats.org/wordprocessingml/2006/main" xmlns:m="http://schemas.openxmlformats.org/officeDocument/2006/math" xmlns:r="http://schemas.openxmlformats.org/officeDocument/2006/relationships" xmlns:o="urn:schemas-microsoft-com:office:office" xmlns:v="urn:schemas-microsoft-com:vml" xmlns:w10="urn:schemas-microsoft-com:office:word" xmlns:a="http://schemas.openxmlformats.org/drawingml/2006/main" xmlns:pic="http://schemas.openxmlformats.org/drawingml/2006/picture" xmlns:wp="http://schemas.openxmlformats.org/drawingml/2006/wordprocessingDrawing">
   <w:body>
-    <w:bookmarkStart w:id="23" w:name="camp_mgmt-module-api-documentation"/>
+    <w:bookmarkStart w:id="26" w:name="camp_mgmt-module-api-documentation"/>
     <w:p>
       <w:pPr>
         <w:pStyle w:val="Heading1"/>
@@ -50,7 +50,31 @@
         <w:t xml:space="preserve"> </w:t>
       </w:r>
       <w:r>
-        <w:t xml:space="preserve">in the University of Kerala online evaluation system — from distributing answer sheet bundles to examiners, tracking marks through multiple evaluation levels, handling revaluation/SMP (Suspected Malpractice) workflows, and closing out camps once evaluation is complete.</w:t>
+        <w:t xml:space="preserve">in the</w:t>
+      </w:r>
+      <w:r>
+        <w:t xml:space="preserve"> </w:t>
+      </w:r>
+      <w:r>
+        <w:t xml:space="preserve">University of Kerala online evaluation system — from distributing</w:t>
+      </w:r>
+      <w:r>
+        <w:t xml:space="preserve"> </w:t>
+      </w:r>
+      <w:r>
+        <w:t xml:space="preserve">answer sheet bundles to examiners, tracking marks through multiple</w:t>
+      </w:r>
+      <w:r>
+        <w:t xml:space="preserve"> </w:t>
+      </w:r>
+      <w:r>
+        <w:t xml:space="preserve">evaluation levels, handling revaluation/SMP (Suspected Malpractice)</w:t>
+      </w:r>
+      <w:r>
+        <w:t xml:space="preserve"> </w:t>
+      </w:r>
+      <w:r>
+        <w:t xml:space="preserve">workflows, and closing out camps once evaluation is complete.</w:t>
       </w:r>
     </w:p>
     <w:bookmarkEnd w:id="20"/>
@@ -92,7 +116,7 @@
       </w:pPr>
       <w:r>
         <w:rPr>
-          <w:rStyle w:val="FunctionTok"/>
+          <w:rStyle w:val="VerbatimChar"/>
         </w:rPr>
         <w:t xml:space="preserve">{</w:t>
       </w:r>
@@ -101,175 +125,43 @@
       </w:r>
       <w:r>
         <w:rPr>
-          <w:rStyle w:val="NormalTok"/>
-        </w:rPr>
-        <w:t xml:space="preserve">  </w:t>
-      </w:r>
-      <w:r>
-        <w:rPr>
-          <w:rStyle w:val="DataTypeTok"/>
-        </w:rPr>
-        <w:t xml:space="preserve">"status"</w:t>
-      </w:r>
-      <w:r>
-        <w:rPr>
-          <w:rStyle w:val="FunctionTok"/>
-        </w:rPr>
-        <w:t xml:space="preserve">:</w:t>
-      </w:r>
-      <w:r>
-        <w:rPr>
-          <w:rStyle w:val="NormalTok"/>
-        </w:rPr>
-        <w:t xml:space="preserve"> </w:t>
-      </w:r>
-      <w:r>
-        <w:rPr>
-          <w:rStyle w:val="KeywordTok"/>
-        </w:rPr>
-        <w:t xml:space="preserve">true</w:t>
-      </w:r>
-      <w:r>
-        <w:rPr>
-          <w:rStyle w:val="FunctionTok"/>
-        </w:rPr>
-        <w:t xml:space="preserve">,</w:t>
+          <w:rStyle w:val="VerbatimChar"/>
+        </w:rPr>
+        <w:t xml:space="preserve">  "status": true,</w:t>
       </w:r>
       <w:r>
         <w:br/>
       </w:r>
       <w:r>
         <w:rPr>
-          <w:rStyle w:val="NormalTok"/>
-        </w:rPr>
-        <w:t xml:space="preserve">  </w:t>
-      </w:r>
-      <w:r>
-        <w:rPr>
-          <w:rStyle w:val="DataTypeTok"/>
-        </w:rPr>
-        <w:t xml:space="preserve">"message"</w:t>
-      </w:r>
-      <w:r>
-        <w:rPr>
-          <w:rStyle w:val="FunctionTok"/>
-        </w:rPr>
-        <w:t xml:space="preserve">:</w:t>
-      </w:r>
-      <w:r>
-        <w:rPr>
-          <w:rStyle w:val="NormalTok"/>
-        </w:rPr>
-        <w:t xml:space="preserve"> </w:t>
-      </w:r>
-      <w:r>
-        <w:rPr>
-          <w:rStyle w:val="StringTok"/>
-        </w:rPr>
-        <w:t xml:space="preserve">"success"</w:t>
-      </w:r>
-      <w:r>
-        <w:rPr>
-          <w:rStyle w:val="FunctionTok"/>
-        </w:rPr>
-        <w:t xml:space="preserve">,</w:t>
+          <w:rStyle w:val="VerbatimChar"/>
+        </w:rPr>
+        <w:t xml:space="preserve">  "message": "success",</w:t>
       </w:r>
       <w:r>
         <w:br/>
       </w:r>
       <w:r>
         <w:rPr>
-          <w:rStyle w:val="NormalTok"/>
-        </w:rPr>
-        <w:t xml:space="preserve">  </w:t>
-      </w:r>
-      <w:r>
-        <w:rPr>
-          <w:rStyle w:val="DataTypeTok"/>
-        </w:rPr>
-        <w:t xml:space="preserve">"data"</w:t>
-      </w:r>
-      <w:r>
-        <w:rPr>
-          <w:rStyle w:val="FunctionTok"/>
-        </w:rPr>
-        <w:t xml:space="preserve">:</w:t>
-      </w:r>
-      <w:r>
-        <w:rPr>
-          <w:rStyle w:val="NormalTok"/>
-        </w:rPr>
-        <w:t xml:space="preserve"> </w:t>
-      </w:r>
-      <w:r>
-        <w:rPr>
-          <w:rStyle w:val="FunctionTok"/>
-        </w:rPr>
-        <w:t xml:space="preserve">{</w:t>
-      </w:r>
-      <w:r>
-        <w:rPr>
-          <w:rStyle w:val="NormalTok"/>
-        </w:rPr>
-        <w:t xml:space="preserve"> </w:t>
-      </w:r>
-      <w:r>
-        <w:rPr>
-          <w:rStyle w:val="ErrorTok"/>
-        </w:rPr>
-        <w:t xml:space="preserve">...</w:t>
-      </w:r>
-      <w:r>
-        <w:rPr>
-          <w:rStyle w:val="NormalTok"/>
-        </w:rPr>
-        <w:t xml:space="preserve"> </w:t>
-      </w:r>
-      <w:r>
-        <w:rPr>
-          <w:rStyle w:val="FunctionTok"/>
-        </w:rPr>
-        <w:t xml:space="preserve">},</w:t>
+          <w:rStyle w:val="VerbatimChar"/>
+        </w:rPr>
+        <w:t xml:space="preserve">  "data": { ... },</w:t>
       </w:r>
       <w:r>
         <w:br/>
       </w:r>
       <w:r>
         <w:rPr>
-          <w:rStyle w:val="NormalTok"/>
-        </w:rPr>
-        <w:t xml:space="preserve">  </w:t>
-      </w:r>
-      <w:r>
-        <w:rPr>
-          <w:rStyle w:val="DataTypeTok"/>
-        </w:rPr>
-        <w:t xml:space="preserve">"status_code"</w:t>
-      </w:r>
-      <w:r>
-        <w:rPr>
-          <w:rStyle w:val="FunctionTok"/>
-        </w:rPr>
-        <w:t xml:space="preserve">:</w:t>
-      </w:r>
-      <w:r>
-        <w:rPr>
-          <w:rStyle w:val="NormalTok"/>
-        </w:rPr>
-        <w:t xml:space="preserve"> </w:t>
-      </w:r>
-      <w:r>
-        <w:rPr>
-          <w:rStyle w:val="DecValTok"/>
-        </w:rPr>
-        <w:t xml:space="preserve">201</w:t>
+          <w:rStyle w:val="VerbatimChar"/>
+        </w:rPr>
+        <w:t xml:space="preserve">  "status_code": 201</w:t>
       </w:r>
       <w:r>
         <w:br/>
       </w:r>
       <w:r>
         <w:rPr>
-          <w:rStyle w:val="FunctionTok"/>
+          <w:rStyle w:val="VerbatimChar"/>
         </w:rPr>
         <w:t xml:space="preserve">}</w:t>
       </w:r>
@@ -352,7 +244,13 @@
         <w:t xml:space="preserve"> </w:t>
       </w:r>
       <w:r>
-        <w:t xml:space="preserve">on success, or an error message/code on failure (e.g. </w:t>
+        <w:t xml:space="preserve">on success, or an error message/code on</w:t>
+      </w:r>
+      <w:r>
+        <w:t xml:space="preserve"> </w:t>
+      </w:r>
+      <w:r>
+        <w:t xml:space="preserve">failure (e.g. </w:t>
       </w:r>
       <w:r>
         <w:rPr>
@@ -412,7 +310,13 @@
         <w:t xml:space="preserve">status_code</w:t>
       </w:r>
       <w:r>
-        <w:t xml:space="preserve">: standard HTTP status code (200 OK, 201 Created, 400 Bad Request, etc).</w:t>
+        <w:t xml:space="preserve">: standard HTTP status code (200 OK, 201 Created, 400</w:t>
+      </w:r>
+      <w:r>
+        <w:t xml:space="preserve"> </w:t>
+      </w:r>
+      <w:r>
+        <w:t xml:space="preserve">Bad Request, etc).</w:t>
       </w:r>
     </w:p>
     <w:p>
@@ -432,7 +336,13 @@
         <w:t xml:space="preserve">try/except</w:t>
       </w:r>
       <w:r>
-        <w:t xml:space="preserve">, so a caller should always check</w:t>
+        <w:t xml:space="preserve">, so a caller should</w:t>
+      </w:r>
+      <w:r>
+        <w:t xml:space="preserve"> </w:t>
+      </w:r>
+      <w:r>
+        <w:t xml:space="preserve">always check</w:t>
       </w:r>
       <w:r>
         <w:t xml:space="preserve"> </w:t>
@@ -460,28 +370,390 @@
       </w:r>
       <w:r>
         <w:t xml:space="preserve">.</w:t>
+      </w:r>
+    </w:p>
+    <w:p>
+      <w:pPr>
+        <w:pStyle w:val="BodyText"/>
+      </w:pPr>
+      <w:r>
+        <w:t xml:space="preserve">Two deviations from this shape have shown up repeatedly enough to call</w:t>
+      </w:r>
+      <w:r>
+        <w:t xml:space="preserve"> </w:t>
+      </w:r>
+      <w:r>
+        <w:t xml:space="preserve">out here rather than repeat in every file: several endpoints pass</w:t>
+      </w:r>
+      <w:r>
+        <w:t xml:space="preserve"> </w:t>
+      </w:r>
+      <w:r>
+        <w:rPr>
+          <w:rStyle w:val="VerbatimChar"/>
+        </w:rPr>
+        <w:t xml:space="preserve">message={}</w:t>
+      </w:r>
+      <w:r>
+        <w:t xml:space="preserve"> </w:t>
+      </w:r>
+      <w:r>
+        <w:t xml:space="preserve">(an empty dict) instead of a real string, and/or omit</w:t>
+      </w:r>
+      <w:r>
+        <w:t xml:space="preserve"> </w:t>
+      </w:r>
+      <w:r>
+        <w:rPr>
+          <w:rStyle w:val="VerbatimChar"/>
+        </w:rPr>
+        <w:t xml:space="preserve">status_code</w:t>
+      </w:r>
+      <w:r>
+        <w:t xml:space="preserve"> </w:t>
+      </w:r>
+      <w:r>
+        <w:t xml:space="preserve">entirely on early-exit /</w:t>
+      </w:r>
+      <w:r>
+        <w:t xml:space="preserve"> </w:t>
+      </w:r>
+      <w:r>
+        <w:t xml:space="preserve">“</w:t>
+      </w:r>
+      <w:r>
+        <w:t xml:space="preserve">nothing found</w:t>
+      </w:r>
+      <w:r>
+        <w:t xml:space="preserve">”</w:t>
+      </w:r>
+      <w:r>
+        <w:t xml:space="preserve"> </w:t>
+      </w:r>
+      <w:r>
+        <w:t xml:space="preserve">branches. Flagged</w:t>
+      </w:r>
+      <w:r>
+        <w:t xml:space="preserve"> </w:t>
+      </w:r>
+      <w:r>
+        <w:t xml:space="preserve">per-endpoint in the relevant doc where it occurs.</w:t>
       </w:r>
     </w:p>
     <w:bookmarkEnd w:id="21"/>
-    <w:bookmarkStart w:id="22" w:name="Xb6168f56817381df0dd5806bfe14767e696e242"/>
+    <w:bookmarkStart w:id="22" w:name="one-doc-file-per-source-file"/>
     <w:p>
       <w:pPr>
         <w:pStyle w:val="Heading2"/>
       </w:pPr>
       <w:r>
-        <w:t xml:space="preserve">Sub-areas in this module (one doc file each)</w:t>
+        <w:t xml:space="preserve">One doc file per source file</w:t>
+      </w:r>
+    </w:p>
+    <w:p>
+      <w:pPr>
+        <w:pStyle w:val="FirstParagraph"/>
+      </w:pPr>
+      <w:r>
+        <w:t xml:space="preserve">Documentation proceeds</w:t>
+      </w:r>
+      <w:r>
+        <w:t xml:space="preserve"> </w:t>
+      </w:r>
+      <w:r>
+        <w:rPr>
+          <w:bCs/>
+          <w:b/>
+        </w:rPr>
+        <w:t xml:space="preserve">one source file at a time, in the order the</w:t>
+      </w:r>
+      <w:r>
+        <w:rPr>
+          <w:bCs/>
+          <w:b/>
+        </w:rPr>
+        <w:t xml:space="preserve"> </w:t>
+      </w:r>
+      <w:r>
+        <w:rPr>
+          <w:bCs/>
+          <w:b/>
+        </w:rPr>
+        <w:t xml:space="preserve">files appear in the codebase</w:t>
+      </w:r>
+      <w:r>
+        <w:t xml:space="preserve"> </w:t>
+      </w:r>
+      <w:r>
+        <w:t xml:space="preserve">(alphabetical), and each is reviewed</w:t>
+      </w:r>
+      <w:r>
+        <w:t xml:space="preserve"> </w:t>
+      </w:r>
+      <w:r>
+        <w:t xml:space="preserve">before moving to the next. Non-API support files (</w:t>
+      </w:r>
+      <w:r>
+        <w:rPr>
+          <w:rStyle w:val="VerbatimChar"/>
+        </w:rPr>
+        <w:t xml:space="preserve">models.py</w:t>
+      </w:r>
+      <w:r>
+        <w:t xml:space="preserve">,</w:t>
+      </w:r>
+      <w:r>
+        <w:t xml:space="preserve"> </w:t>
+      </w:r>
+      <w:r>
+        <w:rPr>
+          <w:rStyle w:val="VerbatimChar"/>
+        </w:rPr>
+        <w:t xml:space="preserve">serializers.py</w:t>
+      </w:r>
+      <w:r>
+        <w:t xml:space="preserve">,</w:t>
+      </w:r>
+      <w:r>
+        <w:t xml:space="preserve"> </w:t>
+      </w:r>
+      <w:r>
+        <w:rPr>
+          <w:rStyle w:val="VerbatimChar"/>
+        </w:rPr>
+        <w:t xml:space="preserve">urls.py</w:t>
+      </w:r>
+      <w:r>
+        <w:t xml:space="preserve">,</w:t>
+      </w:r>
+      <w:r>
+        <w:t xml:space="preserve"> </w:t>
+      </w:r>
+      <w:r>
+        <w:rPr>
+          <w:rStyle w:val="VerbatimChar"/>
+        </w:rPr>
+        <w:t xml:space="preserve">admin.py</w:t>
+      </w:r>
+      <w:r>
+        <w:t xml:space="preserve">,</w:t>
+      </w:r>
+      <w:r>
+        <w:t xml:space="preserve"> </w:t>
+      </w:r>
+      <w:r>
+        <w:rPr>
+          <w:rStyle w:val="VerbatimChar"/>
+        </w:rPr>
+        <w:t xml:space="preserve">apps.py</w:t>
+      </w:r>
+      <w:r>
+        <w:t xml:space="preserve">,</w:t>
+      </w:r>
+      <w:r>
+        <w:t xml:space="preserve"> </w:t>
+      </w:r>
+      <w:r>
+        <w:rPr>
+          <w:rStyle w:val="VerbatimChar"/>
+        </w:rPr>
+        <w:t xml:space="preserve">views.py</w:t>
+      </w:r>
+      <w:r>
+        <w:t xml:space="preserve">,</w:t>
+      </w:r>
+      <w:r>
+        <w:t xml:space="preserve"> </w:t>
+      </w:r>
+      <w:r>
+        <w:rPr>
+          <w:rStyle w:val="VerbatimChar"/>
+        </w:rPr>
+        <w:t xml:space="preserve">tests.py</w:t>
+      </w:r>
+      <w:r>
+        <w:t xml:space="preserve">,</w:t>
+      </w:r>
+      <w:r>
+        <w:t xml:space="preserve"> </w:t>
+      </w:r>
+      <w:r>
+        <w:rPr>
+          <w:rStyle w:val="VerbatimChar"/>
+        </w:rPr>
+        <w:t xml:space="preserve">__init__.py</w:t>
+      </w:r>
+      <w:r>
+        <w:t xml:space="preserve">) aren’t documented separately — they’re</w:t>
+      </w:r>
+      <w:r>
+        <w:t xml:space="preserve"> </w:t>
+      </w:r>
+      <w:r>
+        <w:t xml:space="preserve">referenced from within the endpoint docs as needed.</w:t>
+      </w:r>
+    </w:p>
+    <w:p>
+      <w:pPr>
+        <w:pStyle w:val="BlockText"/>
+      </w:pPr>
+      <w:r>
+        <w:rPr>
+          <w:bCs/>
+          <w:b/>
+        </w:rPr>
+        <w:t xml:space="preserve">Naming convention note</w:t>
+      </w:r>
+      <w:r>
+        <w:t xml:space="preserve">: from</w:t>
+      </w:r>
+      <w:r>
+        <w:t xml:space="preserve"> </w:t>
+      </w:r>
+      <w:r>
+        <w:rPr>
+          <w:rStyle w:val="VerbatimChar"/>
+        </w:rPr>
+        <w:t xml:space="preserve">extmark_entry.py</w:t>
+      </w:r>
+      <w:r>
+        <w:t xml:space="preserve"> </w:t>
+      </w:r>
+      <w:r>
+        <w:t xml:space="preserve">onward, doc files</w:t>
+      </w:r>
+      <w:r>
+        <w:t xml:space="preserve"> </w:t>
+      </w:r>
+      <w:r>
+        <w:t xml:space="preserve">are</w:t>
+      </w:r>
+      <w:r>
+        <w:t xml:space="preserve"> </w:t>
+      </w:r>
+      <w:r>
+        <w:rPr>
+          <w:rStyle w:val="VerbatimChar"/>
+        </w:rPr>
+        <w:t xml:space="preserve">.docx</w:t>
+      </w:r>
+      <w:r>
+        <w:t xml:space="preserve"> </w:t>
+      </w:r>
+      <w:r>
+        <w:t xml:space="preserve">only (no separate</w:t>
+      </w:r>
+      <w:r>
+        <w:t xml:space="preserve"> </w:t>
+      </w:r>
+      <w:r>
+        <w:rPr>
+          <w:rStyle w:val="VerbatimChar"/>
+        </w:rPr>
+        <w:t xml:space="preserve">.md</w:t>
+      </w:r>
+      <w:r>
+        <w:t xml:space="preserve">), named to exactly match the</w:t>
+      </w:r>
+      <w:r>
+        <w:t xml:space="preserve"> </w:t>
+      </w:r>
+      <w:r>
+        <w:t xml:space="preserve">source</w:t>
+      </w:r>
+      <w:r>
+        <w:t xml:space="preserve"> </w:t>
+      </w:r>
+      <w:r>
+        <w:rPr>
+          <w:rStyle w:val="VerbatimChar"/>
+        </w:rPr>
+        <w:t xml:space="preserve">.py</w:t>
+      </w:r>
+      <w:r>
+        <w:t xml:space="preserve"> </w:t>
+      </w:r>
+      <w:r>
+        <w:t xml:space="preserve">filename. The entries below for</w:t>
+      </w:r>
+      <w:r>
+        <w:t xml:space="preserve"> </w:t>
+      </w:r>
+      <w:r>
+        <w:rPr>
+          <w:rStyle w:val="VerbatimChar"/>
+        </w:rPr>
+        <w:t xml:space="preserve">answer_sheet_dist.py</w:t>
+      </w:r>
+      <w:r>
+        <w:t xml:space="preserve"> </w:t>
+      </w:r>
+      <w:r>
+        <w:t xml:space="preserve">through</w:t>
+      </w:r>
+      <w:r>
+        <w:t xml:space="preserve"> </w:t>
+      </w:r>
+      <w:r>
+        <w:rPr>
+          <w:rStyle w:val="VerbatimChar"/>
+        </w:rPr>
+        <w:t xml:space="preserve">disposlist.py</w:t>
+      </w:r>
+      <w:r>
+        <w:t xml:space="preserve"> </w:t>
+      </w:r>
+      <w:r>
+        <w:t xml:space="preserve">predate this convention and use hyphenated</w:t>
+      </w:r>
+      <w:r>
+        <w:t xml:space="preserve"> </w:t>
+      </w:r>
+      <w:r>
+        <w:t xml:space="preserve">names instead (e.g. </w:t>
+      </w:r>
+      <w:r>
+        <w:rPr>
+          <w:rStyle w:val="VerbatimChar"/>
+        </w:rPr>
+        <w:t xml:space="preserve">camp-schedule.docx</w:t>
+      </w:r>
+      <w:r>
+        <w:t xml:space="preserve"> </w:t>
+      </w:r>
+      <w:r>
+        <w:t xml:space="preserve">for</w:t>
+      </w:r>
+      <w:r>
+        <w:t xml:space="preserve"> </w:t>
+      </w:r>
+      <w:r>
+        <w:rPr>
+          <w:rStyle w:val="VerbatimChar"/>
+        </w:rPr>
+        <w:t xml:space="preserve">camp_details.py</w:t>
+      </w:r>
+      <w:r>
+        <w:t xml:space="preserve">) —</w:t>
+      </w:r>
+      <w:r>
+        <w:t xml:space="preserve"> </w:t>
+      </w:r>
+      <w:r>
+        <w:t xml:space="preserve">see the Doc file column for the exact name of each.</w:t>
       </w:r>
     </w:p>
     <w:tbl>
       <w:tblPr>
         <w:tblStyle w:val="Table"/>
-        <w:tblW w:type="pct" w:w="5000"/>
+        <w:tblW w:type="pct" w:w="4921"/>
         <w:tblLook w:firstRow="1" w:lastRow="0" w:firstColumn="0" w:lastColumn="0" w:noHBand="0" w:noVBand="0" w:val="0020"/>
         <w:jc w:val="start"/>
       </w:tblPr>
       <w:tblGrid>
-        <w:gridCol w:w="3960"/>
-        <w:gridCol w:w="3960"/>
+        <w:gridCol w:w="2954"/>
+        <w:gridCol w:w="3080"/>
+        <w:gridCol w:w="1760"/>
       </w:tblGrid>
       <w:tr>
         <w:trPr>
@@ -495,19 +767,31 @@
               <w:jc w:val="left"/>
             </w:pPr>
             <w:r>
-              <w:t xml:space="preserve">File</w:t>
-            </w:r>
-          </w:p>
-        </w:tc>
-        <w:tc>
-          <w:tcPr/>
-          <w:p>
-            <w:pPr>
-              <w:pStyle w:val="Compact"/>
-              <w:jc w:val="left"/>
-            </w:pPr>
-            <w:r>
-              <w:t xml:space="preserve">Covers</w:t>
+              <w:t xml:space="preserve">Source file</w:t>
+            </w:r>
+          </w:p>
+        </w:tc>
+        <w:tc>
+          <w:tcPr/>
+          <w:p>
+            <w:pPr>
+              <w:pStyle w:val="Compact"/>
+              <w:jc w:val="left"/>
+            </w:pPr>
+            <w:r>
+              <w:t xml:space="preserve">Doc file</w:t>
+            </w:r>
+          </w:p>
+        </w:tc>
+        <w:tc>
+          <w:tcPr/>
+          <w:p>
+            <w:pPr>
+              <w:pStyle w:val="Compact"/>
+              <w:jc w:val="left"/>
+            </w:pPr>
+            <w:r>
+              <w:t xml:space="preserve">Status</w:t>
             </w:r>
           </w:p>
         </w:tc>
@@ -524,6 +808,21 @@
               <w:rPr>
                 <w:rStyle w:val="VerbatimChar"/>
               </w:rPr>
+              <w:t xml:space="preserve">answer_sheet_dist.py</w:t>
+            </w:r>
+          </w:p>
+        </w:tc>
+        <w:tc>
+          <w:tcPr/>
+          <w:p>
+            <w:pPr>
+              <w:pStyle w:val="Compact"/>
+              <w:jc w:val="left"/>
+            </w:pPr>
+            <w:r>
+              <w:rPr>
+                <w:rStyle w:val="VerbatimChar"/>
+              </w:rPr>
               <w:t xml:space="preserve">answer-sheet-distribution.md</w:t>
             </w:r>
           </w:p>
@@ -552,19 +851,55 @@
               <w:t xml:space="preserve"> </w:t>
             </w:r>
             <w:r>
-              <w:t xml:space="preserve">— all 42 endpoints from</w:t>
-            </w:r>
-            <w:r>
-              <w:t xml:space="preserve"> </w:t>
-            </w:r>
-            <w:r>
-              <w:rPr>
-                <w:rStyle w:val="VerbatimChar"/>
-              </w:rPr>
-              <w:t xml:space="preserve">answer_sheet_dist.py</w:t>
-            </w:r>
-            <w:r>
-              <w:t xml:space="preserve">: distribution, bundle slip printing, acknowledgement, reallocation, second-level evaluation, answer sheet return, third/next-level evaluation, and sequence number verification</w:t>
+              <w:t xml:space="preserve">— all 42</w:t>
+            </w:r>
+            <w:r>
+              <w:t xml:space="preserve"> </w:t>
+            </w:r>
+            <w:r>
+              <w:t xml:space="preserve">endpoints: distribution,</w:t>
+            </w:r>
+            <w:r>
+              <w:t xml:space="preserve"> </w:t>
+            </w:r>
+            <w:r>
+              <w:t xml:space="preserve">bundle slip printing,</w:t>
+            </w:r>
+            <w:r>
+              <w:t xml:space="preserve"> </w:t>
+            </w:r>
+            <w:r>
+              <w:t xml:space="preserve">acknowledgement,</w:t>
+            </w:r>
+            <w:r>
+              <w:t xml:space="preserve"> </w:t>
+            </w:r>
+            <w:r>
+              <w:t xml:space="preserve">reallocation, second-level</w:t>
+            </w:r>
+            <w:r>
+              <w:t xml:space="preserve"> </w:t>
+            </w:r>
+            <w:r>
+              <w:t xml:space="preserve">evaluation, answer sheet</w:t>
+            </w:r>
+            <w:r>
+              <w:t xml:space="preserve"> </w:t>
+            </w:r>
+            <w:r>
+              <w:t xml:space="preserve">return, third/next-level</w:t>
+            </w:r>
+            <w:r>
+              <w:t xml:space="preserve"> </w:t>
+            </w:r>
+            <w:r>
+              <w:t xml:space="preserve">evaluation, sequence number</w:t>
+            </w:r>
+            <w:r>
+              <w:t xml:space="preserve"> </w:t>
+            </w:r>
+            <w:r>
+              <w:t xml:space="preserve">verification</w:t>
             </w:r>
           </w:p>
         </w:tc>
@@ -581,7 +916,22 @@
               <w:rPr>
                 <w:rStyle w:val="VerbatimChar"/>
               </w:rPr>
-              <w:t xml:space="preserve">bundle-generation.md</w:t>
+              <w:t xml:space="preserve">answercount.py</w:t>
+            </w:r>
+          </w:p>
+        </w:tc>
+        <w:tc>
+          <w:tcPr/>
+          <w:p>
+            <w:pPr>
+              <w:pStyle w:val="Compact"/>
+              <w:jc w:val="left"/>
+            </w:pPr>
+            <w:r>
+              <w:rPr>
+                <w:rStyle w:val="VerbatimChar"/>
+              </w:rPr>
+              <w:t xml:space="preserve">answercount.md</w:t>
             </w:r>
           </w:p>
         </w:tc>
@@ -609,19 +959,19 @@
               <w:t xml:space="preserve"> </w:t>
             </w:r>
             <w:r>
-              <w:t xml:space="preserve">— all 6 endpoints from</w:t>
-            </w:r>
-            <w:r>
-              <w:t xml:space="preserve"> </w:t>
-            </w:r>
-            <w:r>
-              <w:rPr>
-                <w:rStyle w:val="VerbatimChar"/>
-              </w:rPr>
-              <w:t xml:space="preserve">bundle_generation.py</w:t>
-            </w:r>
-            <w:r>
-              <w:t xml:space="preserve">: direct bundle creation by college exam-cell staff (separate from the Camp Officer flow)</w:t>
+              <w:t xml:space="preserve">—</w:t>
+            </w:r>
+            <w:r>
+              <w:t xml:space="preserve"> </w:t>
+            </w:r>
+            <w:r>
+              <w:t xml:space="preserve">exam-code bundle summary</w:t>
+            </w:r>
+            <w:r>
+              <w:t xml:space="preserve"> </w:t>
+            </w:r>
+            <w:r>
+              <w:t xml:space="preserve">across colleges</w:t>
             </w:r>
           </w:p>
         </w:tc>
@@ -638,23 +988,1283 @@
               <w:rPr>
                 <w:rStyle w:val="VerbatimChar"/>
               </w:rPr>
-              <w:t xml:space="preserve">mark-entry.md</w:t>
-            </w:r>
-          </w:p>
-        </w:tc>
-        <w:tc>
-          <w:tcPr/>
-          <w:p>
-            <w:pPr>
-              <w:pStyle w:val="Compact"/>
-              <w:jc w:val="left"/>
-            </w:pPr>
-            <w:r>
-              <w:t xml:space="preserve">Examiner mark entry (web + mobile)</w:t>
-            </w:r>
-            <w:r>
-              <w:t xml:space="preserve"> </w:t>
-            </w:r>
+              <w:t xml:space="preserve">bundle_generation.py</w:t>
+            </w:r>
+          </w:p>
+        </w:tc>
+        <w:tc>
+          <w:tcPr/>
+          <w:p>
+            <w:pPr>
+              <w:pStyle w:val="Compact"/>
+              <w:jc w:val="left"/>
+            </w:pPr>
+            <w:r>
+              <w:rPr>
+                <w:rStyle w:val="VerbatimChar"/>
+              </w:rPr>
+              <w:t xml:space="preserve">bundle-generation.md</w:t>
+            </w:r>
+          </w:p>
+        </w:tc>
+        <w:tc>
+          <w:tcPr/>
+          <w:p>
+            <w:pPr>
+              <w:pStyle w:val="Compact"/>
+              <w:jc w:val="left"/>
+            </w:pPr>
+            <w:r>
+              <w:t xml:space="preserve">✅</w:t>
+            </w:r>
+            <w:r>
+              <w:t xml:space="preserve"> </w:t>
+            </w:r>
+            <w:r>
+              <w:rPr>
+                <w:bCs/>
+                <w:b/>
+              </w:rPr>
+              <w:t xml:space="preserve">Complete</w:t>
+            </w:r>
+            <w:r>
+              <w:t xml:space="preserve"> </w:t>
+            </w:r>
+            <w:r>
+              <w:t xml:space="preserve">— all 6</w:t>
+            </w:r>
+            <w:r>
+              <w:t xml:space="preserve"> </w:t>
+            </w:r>
+            <w:r>
+              <w:t xml:space="preserve">endpoints: direct bundle</w:t>
+            </w:r>
+            <w:r>
+              <w:t xml:space="preserve"> </w:t>
+            </w:r>
+            <w:r>
+              <w:t xml:space="preserve">creation by college</w:t>
+            </w:r>
+            <w:r>
+              <w:t xml:space="preserve"> </w:t>
+            </w:r>
+            <w:r>
+              <w:t xml:space="preserve">exam-cell staff (separate</w:t>
+            </w:r>
+            <w:r>
+              <w:t xml:space="preserve"> </w:t>
+            </w:r>
+            <w:r>
+              <w:t xml:space="preserve">from the Camp Officer flow)</w:t>
+            </w:r>
+          </w:p>
+        </w:tc>
+      </w:tr>
+      <w:tr>
+        <w:tc>
+          <w:tcPr/>
+          <w:p>
+            <w:pPr>
+              <w:pStyle w:val="Compact"/>
+              <w:jc w:val="left"/>
+            </w:pPr>
+            <w:r>
+              <w:rPr>
+                <w:rStyle w:val="VerbatimChar"/>
+              </w:rPr>
+              <w:t xml:space="preserve">camp_details.py</w:t>
+            </w:r>
+          </w:p>
+        </w:tc>
+        <w:tc>
+          <w:tcPr/>
+          <w:p>
+            <w:pPr>
+              <w:pStyle w:val="Compact"/>
+              <w:jc w:val="left"/>
+            </w:pPr>
+            <w:r>
+              <w:rPr>
+                <w:rStyle w:val="VerbatimChar"/>
+              </w:rPr>
+              <w:t xml:space="preserve">camp-schedule.md</w:t>
+            </w:r>
+          </w:p>
+        </w:tc>
+        <w:tc>
+          <w:tcPr/>
+          <w:p>
+            <w:pPr>
+              <w:pStyle w:val="Compact"/>
+              <w:jc w:val="left"/>
+            </w:pPr>
+            <w:r>
+              <w:t xml:space="preserve">✅</w:t>
+            </w:r>
+            <w:r>
+              <w:t xml:space="preserve"> </w:t>
+            </w:r>
+            <w:r>
+              <w:rPr>
+                <w:bCs/>
+                <w:b/>
+              </w:rPr>
+              <w:t xml:space="preserve">Complete</w:t>
+            </w:r>
+            <w:r>
+              <w:t xml:space="preserve"> </w:t>
+            </w:r>
+            <w:r>
+              <w:t xml:space="preserve">— camp</w:t>
+            </w:r>
+            <w:r>
+              <w:t xml:space="preserve"> </w:t>
+            </w:r>
+            <w:r>
+              <w:t xml:space="preserve">schedule list/detail for</w:t>
+            </w:r>
+            <w:r>
+              <w:t xml:space="preserve"> </w:t>
+            </w:r>
+            <w:r>
+              <w:t xml:space="preserve">Admin Officers</w:t>
+            </w:r>
+          </w:p>
+        </w:tc>
+      </w:tr>
+      <w:tr>
+        <w:tc>
+          <w:tcPr/>
+          <w:p>
+            <w:pPr>
+              <w:pStyle w:val="Compact"/>
+              <w:jc w:val="left"/>
+            </w:pPr>
+            <w:r>
+              <w:rPr>
+                <w:rStyle w:val="VerbatimChar"/>
+              </w:rPr>
+              <w:t xml:space="preserve">camp_mobile_rev.py</w:t>
+            </w:r>
+          </w:p>
+        </w:tc>
+        <w:tc>
+          <w:tcPr/>
+          <w:p>
+            <w:pPr>
+              <w:pStyle w:val="Compact"/>
+              <w:jc w:val="left"/>
+            </w:pPr>
+            <w:r>
+              <w:rPr>
+                <w:rStyle w:val="VerbatimChar"/>
+              </w:rPr>
+              <w:t xml:space="preserve">camp-mobile-revaluation.md</w:t>
+            </w:r>
+          </w:p>
+        </w:tc>
+        <w:tc>
+          <w:tcPr/>
+          <w:p>
+            <w:pPr>
+              <w:pStyle w:val="Compact"/>
+              <w:jc w:val="left"/>
+            </w:pPr>
+            <w:r>
+              <w:t xml:space="preserve">✅</w:t>
+            </w:r>
+            <w:r>
+              <w:t xml:space="preserve"> </w:t>
+            </w:r>
+            <w:r>
+              <w:rPr>
+                <w:bCs/>
+                <w:b/>
+              </w:rPr>
+              <w:t xml:space="preserve">Complete</w:t>
+            </w:r>
+            <w:r>
+              <w:t xml:space="preserve"> </w:t>
+            </w:r>
+            <w:r>
+              <w:t xml:space="preserve">— mobile</w:t>
+            </w:r>
+            <w:r>
+              <w:t xml:space="preserve"> </w:t>
+            </w:r>
+            <w:r>
+              <w:t xml:space="preserve">revaluation flow: bundle</w:t>
+            </w:r>
+            <w:r>
+              <w:t xml:space="preserve"> </w:t>
+            </w:r>
+            <w:r>
+              <w:t xml:space="preserve">receive/reject, QR</w:t>
+            </w:r>
+            <w:r>
+              <w:t xml:space="preserve"> </w:t>
+            </w:r>
+            <w:r>
+              <w:t xml:space="preserve">verification, mark upload</w:t>
+            </w:r>
+            <w:r>
+              <w:t xml:space="preserve"> </w:t>
+            </w:r>
+            <w:r>
+              <w:t xml:space="preserve">with averaging/escalation</w:t>
+            </w:r>
+          </w:p>
+        </w:tc>
+      </w:tr>
+      <w:tr>
+        <w:tc>
+          <w:tcPr/>
+          <w:p>
+            <w:pPr>
+              <w:pStyle w:val="Compact"/>
+              <w:jc w:val="left"/>
+            </w:pPr>
+            <w:r>
+              <w:rPr>
+                <w:rStyle w:val="VerbatimChar"/>
+              </w:rPr>
+              <w:t xml:space="preserve">campclosure.py</w:t>
+            </w:r>
+          </w:p>
+        </w:tc>
+        <w:tc>
+          <w:tcPr/>
+          <w:p>
+            <w:pPr>
+              <w:pStyle w:val="Compact"/>
+              <w:jc w:val="left"/>
+            </w:pPr>
+            <w:r>
+              <w:rPr>
+                <w:rStyle w:val="VerbatimChar"/>
+              </w:rPr>
+              <w:t xml:space="preserve">campclosure.md</w:t>
+            </w:r>
+          </w:p>
+        </w:tc>
+        <w:tc>
+          <w:tcPr/>
+          <w:p>
+            <w:pPr>
+              <w:pStyle w:val="Compact"/>
+              <w:jc w:val="left"/>
+            </w:pPr>
+            <w:r>
+              <w:t xml:space="preserve">✅</w:t>
+            </w:r>
+            <w:r>
+              <w:t xml:space="preserve"> </w:t>
+            </w:r>
+            <w:r>
+              <w:rPr>
+                <w:bCs/>
+                <w:b/>
+              </w:rPr>
+              <w:t xml:space="preserve">Complete</w:t>
+            </w:r>
+            <w:r>
+              <w:t xml:space="preserve"> </w:t>
+            </w:r>
+            <w:r>
+              <w:t xml:space="preserve">— camp</w:t>
+            </w:r>
+            <w:r>
+              <w:t xml:space="preserve"> </w:t>
+            </w:r>
+            <w:r>
+              <w:t xml:space="preserve">closure bundle lookup +</w:t>
+            </w:r>
+            <w:r>
+              <w:t xml:space="preserve"> </w:t>
+            </w:r>
+            <w:r>
+              <w:t xml:space="preserve">cellar rack assignment</w:t>
+            </w:r>
+          </w:p>
+        </w:tc>
+      </w:tr>
+      <w:tr>
+        <w:tc>
+          <w:tcPr/>
+          <w:p>
+            <w:pPr>
+              <w:pStyle w:val="Compact"/>
+              <w:jc w:val="left"/>
+            </w:pPr>
+            <w:r>
+              <w:rPr>
+                <w:rStyle w:val="VerbatimChar"/>
+              </w:rPr>
+              <w:t xml:space="preserve">campmarklist.py</w:t>
+            </w:r>
+          </w:p>
+        </w:tc>
+        <w:tc>
+          <w:tcPr/>
+          <w:p>
+            <w:pPr>
+              <w:pStyle w:val="Compact"/>
+              <w:jc w:val="left"/>
+            </w:pPr>
+            <w:r>
+              <w:rPr>
+                <w:rStyle w:val="VerbatimChar"/>
+              </w:rPr>
+              <w:t xml:space="preserve">campmarklist.md</w:t>
+            </w:r>
+          </w:p>
+        </w:tc>
+        <w:tc>
+          <w:tcPr/>
+          <w:p>
+            <w:pPr>
+              <w:pStyle w:val="Compact"/>
+              <w:jc w:val="left"/>
+            </w:pPr>
+            <w:r>
+              <w:t xml:space="preserve">✅</w:t>
+            </w:r>
+            <w:r>
+              <w:t xml:space="preserve"> </w:t>
+            </w:r>
+            <w:r>
+              <w:rPr>
+                <w:bCs/>
+                <w:b/>
+              </w:rPr>
+              <w:t xml:space="preserve">Complete</w:t>
+            </w:r>
+            <w:r>
+              <w:t xml:space="preserve"> </w:t>
+            </w:r>
+            <w:r>
+              <w:t xml:space="preserve">— camp</w:t>
+            </w:r>
+            <w:r>
+              <w:t xml:space="preserve"> </w:t>
+            </w:r>
+            <w:r>
+              <w:t xml:space="preserve">officer/chairman and</w:t>
+            </w:r>
+            <w:r>
+              <w:t xml:space="preserve"> </w:t>
+            </w:r>
+            <w:r>
+              <w:t xml:space="preserve">examiner-facing mark</w:t>
+            </w:r>
+            <w:r>
+              <w:t xml:space="preserve"> </w:t>
+            </w:r>
+            <w:r>
+              <w:t xml:space="preserve">comparison grids</w:t>
+            </w:r>
+          </w:p>
+        </w:tc>
+      </w:tr>
+      <w:tr>
+        <w:tc>
+          <w:tcPr/>
+          <w:p>
+            <w:pPr>
+              <w:pStyle w:val="Compact"/>
+              <w:jc w:val="left"/>
+            </w:pPr>
+            <w:r>
+              <w:rPr>
+                <w:rStyle w:val="VerbatimChar"/>
+              </w:rPr>
+              <w:t xml:space="preserve">campmobile.py</w:t>
+            </w:r>
+          </w:p>
+        </w:tc>
+        <w:tc>
+          <w:tcPr/>
+          <w:p>
+            <w:pPr>
+              <w:pStyle w:val="Compact"/>
+              <w:jc w:val="left"/>
+            </w:pPr>
+            <w:r>
+              <w:rPr>
+                <w:rStyle w:val="VerbatimChar"/>
+              </w:rPr>
+              <w:t xml:space="preserve">campmobile.md</w:t>
+            </w:r>
+          </w:p>
+        </w:tc>
+        <w:tc>
+          <w:tcPr/>
+          <w:p>
+            <w:pPr>
+              <w:pStyle w:val="Compact"/>
+              <w:jc w:val="left"/>
+            </w:pPr>
+            <w:r>
+              <w:t xml:space="preserve">✅</w:t>
+            </w:r>
+            <w:r>
+              <w:t xml:space="preserve"> </w:t>
+            </w:r>
+            <w:r>
+              <w:rPr>
+                <w:bCs/>
+                <w:b/>
+              </w:rPr>
+              <w:t xml:space="preserve">Complete</w:t>
+            </w:r>
+            <w:r>
+              <w:t xml:space="preserve"> </w:t>
+            </w:r>
+            <w:r>
+              <w:t xml:space="preserve">— legacy</w:t>
+            </w:r>
+            <w:r>
+              <w:t xml:space="preserve"> </w:t>
+            </w:r>
+            <w:r>
+              <w:t xml:space="preserve">“</w:t>
+            </w:r>
+            <w:r>
+              <w:t xml:space="preserve">old mark entry app</w:t>
+            </w:r>
+            <w:r>
+              <w:t xml:space="preserve">”</w:t>
+            </w:r>
+            <w:r>
+              <w:t xml:space="preserve">;</w:t>
+            </w:r>
+            <w:r>
+              <w:t xml:space="preserve"> </w:t>
+            </w:r>
+            <w:r>
+              <w:t xml:space="preserve">mostly dead code,</w:t>
+            </w:r>
+            <w:r>
+              <w:t xml:space="preserve"> </w:t>
+            </w:r>
+            <w:r>
+              <w:t xml:space="preserve">superseded by</w:t>
+            </w:r>
+            <w:r>
+              <w:t xml:space="preserve"> </w:t>
+            </w:r>
+            <w:r>
+              <w:rPr>
+                <w:rStyle w:val="VerbatimChar"/>
+              </w:rPr>
+              <w:t xml:space="preserve">mark_entry_moble_app.py</w:t>
+            </w:r>
+          </w:p>
+        </w:tc>
+      </w:tr>
+      <w:tr>
+        <w:tc>
+          <w:tcPr/>
+          <w:p>
+            <w:pPr>
+              <w:pStyle w:val="Compact"/>
+              <w:jc w:val="left"/>
+            </w:pPr>
+            <w:r>
+              <w:rPr>
+                <w:rStyle w:val="VerbatimChar"/>
+              </w:rPr>
+              <w:t xml:space="preserve">cellar_inventory.py</w:t>
+            </w:r>
+          </w:p>
+        </w:tc>
+        <w:tc>
+          <w:tcPr/>
+          <w:p>
+            <w:pPr>
+              <w:pStyle w:val="Compact"/>
+              <w:jc w:val="left"/>
+            </w:pPr>
+            <w:r>
+              <w:rPr>
+                <w:rStyle w:val="VerbatimChar"/>
+              </w:rPr>
+              <w:t xml:space="preserve">cellar-inventory.md</w:t>
+            </w:r>
+          </w:p>
+        </w:tc>
+        <w:tc>
+          <w:tcPr/>
+          <w:p>
+            <w:pPr>
+              <w:pStyle w:val="Compact"/>
+              <w:jc w:val="left"/>
+            </w:pPr>
+            <w:r>
+              <w:t xml:space="preserve">✅</w:t>
+            </w:r>
+            <w:r>
+              <w:t xml:space="preserve"> </w:t>
+            </w:r>
+            <w:r>
+              <w:rPr>
+                <w:bCs/>
+                <w:b/>
+              </w:rPr>
+              <w:t xml:space="preserve">Complete</w:t>
+            </w:r>
+            <w:r>
+              <w:t xml:space="preserve"> </w:t>
+            </w:r>
+            <w:r>
+              <w:t xml:space="preserve">— rack</w:t>
+            </w:r>
+            <w:r>
+              <w:t xml:space="preserve"> </w:t>
+            </w:r>
+            <w:r>
+              <w:t xml:space="preserve">storage lookup, flagging,</w:t>
+            </w:r>
+            <w:r>
+              <w:t xml:space="preserve"> </w:t>
+            </w:r>
+            <w:r>
+              <w:t xml:space="preserve">printable view</w:t>
+            </w:r>
+          </w:p>
+        </w:tc>
+      </w:tr>
+      <w:tr>
+        <w:tc>
+          <w:tcPr/>
+          <w:p>
+            <w:pPr>
+              <w:pStyle w:val="Compact"/>
+              <w:jc w:val="left"/>
+            </w:pPr>
+            <w:r>
+              <w:rPr>
+                <w:rStyle w:val="VerbatimChar"/>
+              </w:rPr>
+              <w:t xml:space="preserve">chief_mark_view.py</w:t>
+            </w:r>
+          </w:p>
+        </w:tc>
+        <w:tc>
+          <w:tcPr/>
+          <w:p>
+            <w:pPr>
+              <w:pStyle w:val="Compact"/>
+              <w:jc w:val="left"/>
+            </w:pPr>
+            <w:r>
+              <w:rPr>
+                <w:rStyle w:val="VerbatimChar"/>
+              </w:rPr>
+              <w:t xml:space="preserve">chief-mark-view.md</w:t>
+            </w:r>
+          </w:p>
+        </w:tc>
+        <w:tc>
+          <w:tcPr/>
+          <w:p>
+            <w:pPr>
+              <w:pStyle w:val="Compact"/>
+              <w:jc w:val="left"/>
+            </w:pPr>
+            <w:r>
+              <w:t xml:space="preserve">✅</w:t>
+            </w:r>
+            <w:r>
+              <w:t xml:space="preserve"> </w:t>
+            </w:r>
+            <w:r>
+              <w:rPr>
+                <w:bCs/>
+                <w:b/>
+              </w:rPr>
+              <w:t xml:space="preserve">Complete</w:t>
+            </w:r>
+            <w:r>
+              <w:t xml:space="preserve"> </w:t>
+            </w:r>
+            <w:r>
+              <w:t xml:space="preserve">— Chief</w:t>
+            </w:r>
+            <w:r>
+              <w:t xml:space="preserve"> </w:t>
+            </w:r>
+            <w:r>
+              <w:t xml:space="preserve">Examiner web mark viewing</w:t>
+            </w:r>
+            <w:r>
+              <w:t xml:space="preserve"> </w:t>
+            </w:r>
+            <w:r>
+              <w:t xml:space="preserve">drill-down (read-only,</w:t>
+            </w:r>
+            <w:r>
+              <w:t xml:space="preserve"> </w:t>
+            </w:r>
+            <w:r>
+              <w:t xml:space="preserve">despite the</w:t>
+            </w:r>
+            <w:r>
+              <w:t xml:space="preserve"> </w:t>
+            </w:r>
+            <w:r>
+              <w:t xml:space="preserve">“</w:t>
+            </w:r>
+            <w:r>
+              <w:t xml:space="preserve">Mark Update</w:t>
+            </w:r>
+            <w:r>
+              <w:t xml:space="preserve">”</w:t>
+            </w:r>
+            <w:r>
+              <w:t xml:space="preserve"> </w:t>
+            </w:r>
+            <w:r>
+              <w:t xml:space="preserve">naming)</w:t>
+            </w:r>
+          </w:p>
+        </w:tc>
+      </w:tr>
+      <w:tr>
+        <w:tc>
+          <w:tcPr/>
+          <w:p>
+            <w:pPr>
+              <w:pStyle w:val="Compact"/>
+              <w:jc w:val="left"/>
+            </w:pPr>
+            <w:r>
+              <w:rPr>
+                <w:rStyle w:val="VerbatimChar"/>
+              </w:rPr>
+              <w:t xml:space="preserve">codemarkapprove.py</w:t>
+            </w:r>
+          </w:p>
+        </w:tc>
+        <w:tc>
+          <w:tcPr/>
+          <w:p>
+            <w:pPr>
+              <w:pStyle w:val="Compact"/>
+              <w:jc w:val="left"/>
+            </w:pPr>
+            <w:r>
+              <w:rPr>
+                <w:rStyle w:val="VerbatimChar"/>
+              </w:rPr>
+              <w:t xml:space="preserve">codemarkapprove.md</w:t>
+            </w:r>
+          </w:p>
+        </w:tc>
+        <w:tc>
+          <w:tcPr/>
+          <w:p>
+            <w:pPr>
+              <w:pStyle w:val="Compact"/>
+              <w:jc w:val="left"/>
+            </w:pPr>
+            <w:r>
+              <w:t xml:space="preserve">✅</w:t>
+            </w:r>
+            <w:r>
+              <w:t xml:space="preserve"> </w:t>
+            </w:r>
+            <w:r>
+              <w:rPr>
+                <w:bCs/>
+                <w:b/>
+              </w:rPr>
+              <w:t xml:space="preserve">Complete</w:t>
+            </w:r>
+            <w:r>
+              <w:t xml:space="preserve"> </w:t>
+            </w:r>
+            <w:r>
+              <w:t xml:space="preserve">—</w:t>
+            </w:r>
+            <w:r>
+              <w:t xml:space="preserve"> </w:t>
+            </w:r>
+            <w:r>
+              <w:t xml:space="preserve">Coordinator internal-mark</w:t>
+            </w:r>
+            <w:r>
+              <w:t xml:space="preserve"> </w:t>
+            </w:r>
+            <w:r>
+              <w:t xml:space="preserve">review &amp; publish flow for</w:t>
+            </w:r>
+            <w:r>
+              <w:t xml:space="preserve"> </w:t>
+            </w:r>
+            <w:r>
+              <w:t xml:space="preserve">external teachers</w:t>
+            </w:r>
+          </w:p>
+        </w:tc>
+      </w:tr>
+      <w:tr>
+        <w:tc>
+          <w:tcPr/>
+          <w:p>
+            <w:pPr>
+              <w:pStyle w:val="Compact"/>
+              <w:jc w:val="left"/>
+            </w:pPr>
+            <w:r>
+              <w:rPr>
+                <w:rStyle w:val="VerbatimChar"/>
+              </w:rPr>
+              <w:t xml:space="preserve">direct_bundle_dist.py</w:t>
+            </w:r>
+          </w:p>
+        </w:tc>
+        <w:tc>
+          <w:tcPr/>
+          <w:p>
+            <w:pPr>
+              <w:pStyle w:val="Compact"/>
+              <w:jc w:val="left"/>
+            </w:pPr>
+            <w:r>
+              <w:rPr>
+                <w:rStyle w:val="VerbatimChar"/>
+              </w:rPr>
+              <w:t xml:space="preserve">direct-bundle-dist.md</w:t>
+            </w:r>
+          </w:p>
+        </w:tc>
+        <w:tc>
+          <w:tcPr/>
+          <w:p>
+            <w:pPr>
+              <w:pStyle w:val="Compact"/>
+              <w:jc w:val="left"/>
+            </w:pPr>
+            <w:r>
+              <w:t xml:space="preserve">✅</w:t>
+            </w:r>
+            <w:r>
+              <w:t xml:space="preserve"> </w:t>
+            </w:r>
+            <w:r>
+              <w:rPr>
+                <w:bCs/>
+                <w:b/>
+              </w:rPr>
+              <w:t xml:space="preserve">Complete</w:t>
+            </w:r>
+            <w:r>
+              <w:t xml:space="preserve"> </w:t>
+            </w:r>
+            <w:r>
+              <w:t xml:space="preserve">— Camp</w:t>
+            </w:r>
+            <w:r>
+              <w:t xml:space="preserve"> </w:t>
+            </w:r>
+            <w:r>
+              <w:t xml:space="preserve">Officer direct</w:t>
+            </w:r>
+            <w:r>
+              <w:t xml:space="preserve"> </w:t>
+            </w:r>
+            <w:r>
+              <w:t xml:space="preserve">examiner-to-bundle</w:t>
+            </w:r>
+            <w:r>
+              <w:t xml:space="preserve"> </w:t>
+            </w:r>
+            <w:r>
+              <w:t xml:space="preserve">allocation</w:t>
+            </w:r>
+          </w:p>
+        </w:tc>
+      </w:tr>
+      <w:tr>
+        <w:tc>
+          <w:tcPr/>
+          <w:p>
+            <w:pPr>
+              <w:pStyle w:val="Compact"/>
+              <w:jc w:val="left"/>
+            </w:pPr>
+            <w:r>
+              <w:rPr>
+                <w:rStyle w:val="VerbatimChar"/>
+              </w:rPr>
+              <w:t xml:space="preserve">disposlist.py</w:t>
+            </w:r>
+          </w:p>
+        </w:tc>
+        <w:tc>
+          <w:tcPr/>
+          <w:p>
+            <w:pPr>
+              <w:pStyle w:val="Compact"/>
+              <w:jc w:val="left"/>
+            </w:pPr>
+            <w:r>
+              <w:rPr>
+                <w:rStyle w:val="VerbatimChar"/>
+              </w:rPr>
+              <w:t xml:space="preserve">disposlist.md</w:t>
+            </w:r>
+          </w:p>
+        </w:tc>
+        <w:tc>
+          <w:tcPr/>
+          <w:p>
+            <w:pPr>
+              <w:pStyle w:val="Compact"/>
+              <w:jc w:val="left"/>
+            </w:pPr>
+            <w:r>
+              <w:t xml:space="preserve">✅</w:t>
+            </w:r>
+            <w:r>
+              <w:t xml:space="preserve"> </w:t>
+            </w:r>
+            <w:r>
+              <w:rPr>
+                <w:bCs/>
+                <w:b/>
+              </w:rPr>
+              <w:t xml:space="preserve">Complete</w:t>
+            </w:r>
+            <w:r>
+              <w:t xml:space="preserve"> </w:t>
+            </w:r>
+            <w:r>
+              <w:t xml:space="preserve">— cellar</w:t>
+            </w:r>
+            <w:r>
+              <w:t xml:space="preserve"> </w:t>
+            </w:r>
+            <w:r>
+              <w:t xml:space="preserve">disposal eligibility list +</w:t>
+            </w:r>
+            <w:r>
+              <w:t xml:space="preserve"> </w:t>
+            </w:r>
+            <w:r>
+              <w:t xml:space="preserve">permanent record deletion</w:t>
+            </w:r>
+            <w:r>
+              <w:t xml:space="preserve"> </w:t>
+            </w:r>
+            <w:r>
+              <w:t xml:space="preserve">(has active data-integrity</w:t>
+            </w:r>
+            <w:r>
+              <w:t xml:space="preserve"> </w:t>
+            </w:r>
+            <w:r>
+              <w:t xml:space="preserve">bugs, see above)</w:t>
+            </w:r>
+          </w:p>
+        </w:tc>
+      </w:tr>
+      <w:tr>
+        <w:tc>
+          <w:tcPr/>
+          <w:p>
+            <w:pPr>
+              <w:pStyle w:val="Compact"/>
+              <w:jc w:val="left"/>
+            </w:pPr>
+            <w:r>
+              <w:rPr>
+                <w:rStyle w:val="VerbatimChar"/>
+              </w:rPr>
+              <w:t xml:space="preserve">extmark_entry.py</w:t>
+            </w:r>
+          </w:p>
+        </w:tc>
+        <w:tc>
+          <w:tcPr/>
+          <w:p>
+            <w:pPr>
+              <w:pStyle w:val="Compact"/>
+              <w:jc w:val="left"/>
+            </w:pPr>
+            <w:r>
+              <w:rPr>
+                <w:rStyle w:val="VerbatimChar"/>
+              </w:rPr>
+              <w:t xml:space="preserve">extmark_entry.docx</w:t>
+            </w:r>
+          </w:p>
+        </w:tc>
+        <w:tc>
+          <w:tcPr/>
+          <w:p>
+            <w:pPr>
+              <w:pStyle w:val="Compact"/>
+              <w:jc w:val="left"/>
+            </w:pPr>
+            <w:r>
+              <w:t xml:space="preserve">✅</w:t>
+            </w:r>
+            <w:r>
+              <w:t xml:space="preserve"> </w:t>
+            </w:r>
+            <w:r>
+              <w:rPr>
+                <w:bCs/>
+                <w:b/>
+              </w:rPr>
+              <w:t xml:space="preserve">Complete</w:t>
+            </w:r>
+            <w:r>
+              <w:t xml:space="preserve"> </w:t>
+            </w:r>
+            <w:r>
+              <w:t xml:space="preserve">—</w:t>
+            </w:r>
+            <w:r>
+              <w:t xml:space="preserve"> </w:t>
+            </w:r>
+            <w:r>
+              <w:t xml:space="preserve">external teacher</w:t>
+            </w:r>
+            <w:r>
+              <w:t xml:space="preserve"> </w:t>
+            </w:r>
+            <w:r>
+              <w:t xml:space="preserve">internal-mark entry (has an</w:t>
+            </w:r>
+            <w:r>
+              <w:t xml:space="preserve"> </w:t>
+            </w:r>
+            <w:r>
+              <w:rPr>
+                <w:rStyle w:val="VerbatimChar"/>
+              </w:rPr>
+              <w:t xml:space="preserve">eval()</w:t>
+            </w:r>
+            <w:r>
+              <w:t xml:space="preserve"> </w:t>
+            </w:r>
+            <w:r>
+              <w:t xml:space="preserve">security concern,</w:t>
+            </w:r>
+            <w:r>
+              <w:t xml:space="preserve"> </w:t>
+            </w:r>
+            <w:r>
+              <w:t xml:space="preserve">see above)</w:t>
+            </w:r>
+          </w:p>
+        </w:tc>
+      </w:tr>
+      <w:tr>
+        <w:tc>
+          <w:tcPr/>
+          <w:p>
+            <w:pPr>
+              <w:pStyle w:val="Compact"/>
+              <w:jc w:val="left"/>
+            </w:pPr>
+            <w:r>
+              <w:rPr>
+                <w:rStyle w:val="VerbatimChar"/>
+              </w:rPr>
+              <w:t xml:space="preserve">exttchr_allocation.py</w:t>
+            </w:r>
+          </w:p>
+        </w:tc>
+        <w:tc>
+          <w:tcPr/>
+          <w:p>
+            <w:pPr>
+              <w:pStyle w:val="Compact"/>
+              <w:jc w:val="left"/>
+            </w:pPr>
+            <w:r>
+              <w:rPr>
+                <w:rStyle w:val="VerbatimChar"/>
+              </w:rPr>
+              <w:t xml:space="preserve">exttchr_allocation.docx</w:t>
+            </w:r>
+          </w:p>
+        </w:tc>
+        <w:tc>
+          <w:tcPr/>
+          <w:p>
+            <w:pPr>
+              <w:pStyle w:val="Compact"/>
+              <w:jc w:val="left"/>
+            </w:pPr>
+            <w:r>
+              <w:t xml:space="preserve">✅</w:t>
+            </w:r>
+            <w:r>
+              <w:t xml:space="preserve"> </w:t>
+            </w:r>
+            <w:r>
+              <w:rPr>
+                <w:bCs/>
+                <w:b/>
+              </w:rPr>
+              <w:t xml:space="preserve">Complete</w:t>
+            </w:r>
+            <w:r>
+              <w:t xml:space="preserve"> </w:t>
+            </w:r>
+            <w:r>
+              <w:t xml:space="preserve">— teacher</w:t>
+            </w:r>
+            <w:r>
+              <w:t xml:space="preserve"> </w:t>
+            </w:r>
+            <w:r>
+              <w:t xml:space="preserve">search + external teacher</w:t>
+            </w:r>
+            <w:r>
+              <w:t xml:space="preserve"> </w:t>
+            </w:r>
+            <w:r>
+              <w:t xml:space="preserve">allocation setup (has a</w:t>
+            </w:r>
+            <w:r>
+              <w:t xml:space="preserve"> </w:t>
+            </w:r>
+            <w:r>
+              <w:rPr>
+                <w:rStyle w:val="VerbatimChar"/>
+              </w:rPr>
+              <w:t xml:space="preserve">NameError</w:t>
+            </w:r>
+            <w:r>
+              <w:t xml:space="preserve"> </w:t>
+            </w:r>
+            <w:r>
+              <w:t xml:space="preserve">risk and a</w:t>
+            </w:r>
+            <w:r>
+              <w:t xml:space="preserve"> </w:t>
+            </w:r>
+            <w:r>
+              <w:t xml:space="preserve">third occurrence of the</w:t>
+            </w:r>
+            <w:r>
+              <w:t xml:space="preserve"> </w:t>
+            </w:r>
+            <w:r>
+              <w:t xml:space="preserve">set-literal bug, see above)</w:t>
+            </w:r>
+          </w:p>
+        </w:tc>
+      </w:tr>
+      <w:tr>
+        <w:tc>
+          <w:tcPr/>
+          <w:p>
+            <w:pPr>
+              <w:pStyle w:val="Compact"/>
+              <w:jc w:val="left"/>
+            </w:pPr>
+            <w:r>
+              <w:rPr>
+                <w:rStyle w:val="VerbatimChar"/>
+              </w:rPr>
+              <w:t xml:space="preserve">facingsheet.py</w:t>
+            </w:r>
+          </w:p>
+        </w:tc>
+        <w:tc>
+          <w:tcPr/>
+          <w:p>
+            <w:pPr>
+              <w:pStyle w:val="Compact"/>
+              <w:jc w:val="left"/>
+            </w:pPr>
+            <w:r>
+              <w:rPr>
+                <w:rStyle w:val="VerbatimChar"/>
+              </w:rPr>
+              <w:t xml:space="preserve">facingsheet.docx</w:t>
+            </w:r>
+          </w:p>
+        </w:tc>
+        <w:tc>
+          <w:tcPr/>
+          <w:p>
+            <w:pPr>
+              <w:pStyle w:val="Compact"/>
+              <w:jc w:val="left"/>
+            </w:pPr>
+            <w:r>
+              <w:t xml:space="preserve">✅</w:t>
+            </w:r>
+            <w:r>
+              <w:t xml:space="preserve"> </w:t>
+            </w:r>
+            <w:r>
+              <w:rPr>
+                <w:bCs/>
+                <w:b/>
+              </w:rPr>
+              <w:t xml:space="preserve">Complete</w:t>
+            </w:r>
+            <w:r>
+              <w:t xml:space="preserve"> </w:t>
+            </w:r>
+            <w:r>
+              <w:t xml:space="preserve">— facing</w:t>
+            </w:r>
+            <w:r>
+              <w:t xml:space="preserve"> </w:t>
+            </w:r>
+            <w:r>
+              <w:t xml:space="preserve">sheet printing (both</w:t>
+            </w:r>
+            <w:r>
+              <w:t xml:space="preserve"> </w:t>
+            </w:r>
+            <w:r>
+              <w:t xml:space="preserve">scan-based and manual</w:t>
+            </w:r>
+            <w:r>
+              <w:t xml:space="preserve"> </w:t>
+            </w:r>
+            <w:r>
+              <w:t xml:space="preserve">flows) plus QR</w:t>
+            </w:r>
+            <w:r>
+              <w:t xml:space="preserve"> </w:t>
+            </w:r>
+            <w:r>
+              <w:t xml:space="preserve">decode/eligibility checks;</w:t>
+            </w:r>
+            <w:r>
+              <w:t xml:space="preserve"> </w:t>
+            </w:r>
+            <w:r>
+              <w:t xml:space="preserve">one write exposed as</w:t>
+            </w:r>
+            <w:r>
+              <w:t xml:space="preserve"> </w:t>
+            </w:r>
+            <w:r>
+              <w:rPr>
+                <w:rStyle w:val="VerbatimChar"/>
+              </w:rPr>
+              <w:t xml:space="preserve">GET</w:t>
+            </w:r>
+            <w:r>
+              <w:t xml:space="preserve"> </w:t>
+            </w:r>
+            <w:r>
+              <w:t xml:space="preserve">(see note in the doc)</w:t>
+            </w:r>
+          </w:p>
+        </w:tc>
+      </w:tr>
+      <w:tr>
+        <w:tc>
+          <w:tcPr/>
+          <w:p>
+            <w:pPr>
+              <w:pStyle w:val="Compact"/>
+              <w:jc w:val="left"/>
+            </w:pPr>
+            <w:r>
+              <w:rPr>
+                <w:rStyle w:val="VerbatimChar"/>
+              </w:rPr>
+              <w:t xml:space="preserve">mark_approve.py</w:t>
+            </w:r>
+          </w:p>
+        </w:tc>
+        <w:tc>
+          <w:tcPr/>
+          <w:p>
+            <w:pPr>
+              <w:pStyle w:val="Compact"/>
+              <w:jc w:val="left"/>
+            </w:pPr>
+            <w:r>
+              <w:rPr>
+                <w:rStyle w:val="VerbatimChar"/>
+              </w:rPr>
+              <w:t xml:space="preserve">mark_approve.docx</w:t>
+            </w:r>
+          </w:p>
+        </w:tc>
+        <w:tc>
+          <w:tcPr/>
+          <w:p>
+            <w:pPr>
+              <w:pStyle w:val="Compact"/>
+              <w:jc w:val="left"/>
+            </w:pPr>
+            <w:r>
+              <w:t xml:space="preserve">✅</w:t>
+            </w:r>
+            <w:r>
+              <w:t xml:space="preserve"> </w:t>
+            </w:r>
+            <w:r>
+              <w:rPr>
+                <w:bCs/>
+                <w:b/>
+              </w:rPr>
+              <w:t xml:space="preserve">Complete</w:t>
+            </w:r>
+            <w:r>
+              <w:t xml:space="preserve"> </w:t>
+            </w:r>
+            <w:r>
+              <w:t xml:space="preserve">— Chairman/Deputy Chairman mark approval + mark override (has a missing permission check on the write endpoint, see above)</w:t>
+            </w:r>
+          </w:p>
+        </w:tc>
+      </w:tr>
+      <w:tr>
+        <w:tc>
+          <w:tcPr/>
+          <w:p>
+            <w:pPr>
+              <w:pStyle w:val="Compact"/>
+              <w:jc w:val="left"/>
+            </w:pPr>
+            <w:r>
+              <w:rPr>
+                <w:rStyle w:val="VerbatimChar"/>
+              </w:rPr>
+              <w:t xml:space="preserve">mark_compare.py</w:t>
+            </w:r>
+          </w:p>
+        </w:tc>
+        <w:tc>
+          <w:tcPr/>
+          <w:p>
+            <w:pPr>
+              <w:pStyle w:val="Compact"/>
+              <w:jc w:val="left"/>
+            </w:pPr>
+            <w:r>
+              <w:rPr>
+                <w:rStyle w:val="VerbatimChar"/>
+              </w:rPr>
+              <w:t xml:space="preserve">mark_compare.docx</w:t>
+            </w:r>
+          </w:p>
+        </w:tc>
+        <w:tc>
+          <w:tcPr/>
+          <w:p>
+            <w:pPr>
+              <w:pStyle w:val="Compact"/>
+              <w:jc w:val="left"/>
+            </w:pPr>
             <w:r>
               <w:rPr>
                 <w:iCs/>
@@ -677,23 +2287,32 @@
               <w:rPr>
                 <w:rStyle w:val="VerbatimChar"/>
               </w:rPr>
-              <w:t xml:space="preserve">mark-approve-compare.md</w:t>
-            </w:r>
-          </w:p>
-        </w:tc>
-        <w:tc>
-          <w:tcPr/>
-          <w:p>
-            <w:pPr>
-              <w:pStyle w:val="Compact"/>
-              <w:jc w:val="left"/>
-            </w:pPr>
-            <w:r>
-              <w:t xml:space="preserve">Mark approval and second-level mark comparison</w:t>
-            </w:r>
-            <w:r>
-              <w:t xml:space="preserve"> </w:t>
-            </w:r>
+              <w:t xml:space="preserve">mark_entry.py</w:t>
+            </w:r>
+          </w:p>
+        </w:tc>
+        <w:tc>
+          <w:tcPr/>
+          <w:p>
+            <w:pPr>
+              <w:pStyle w:val="Compact"/>
+              <w:jc w:val="left"/>
+            </w:pPr>
+            <w:r>
+              <w:rPr>
+                <w:rStyle w:val="VerbatimChar"/>
+              </w:rPr>
+              <w:t xml:space="preserve">mark_entry.docx</w:t>
+            </w:r>
+          </w:p>
+        </w:tc>
+        <w:tc>
+          <w:tcPr/>
+          <w:p>
+            <w:pPr>
+              <w:pStyle w:val="Compact"/>
+              <w:jc w:val="left"/>
+            </w:pPr>
             <w:r>
               <w:rPr>
                 <w:iCs/>
@@ -716,23 +2335,32 @@
               <w:rPr>
                 <w:rStyle w:val="VerbatimChar"/>
               </w:rPr>
-              <w:t xml:space="preserve">camp-schedule.md</w:t>
-            </w:r>
-          </w:p>
-        </w:tc>
-        <w:tc>
-          <w:tcPr/>
-          <w:p>
-            <w:pPr>
-              <w:pStyle w:val="Compact"/>
-              <w:jc w:val="left"/>
-            </w:pPr>
-            <w:r>
-              <w:t xml:space="preserve">Camp schedule setup and listing</w:t>
-            </w:r>
-            <w:r>
-              <w:t xml:space="preserve"> </w:t>
-            </w:r>
+              <w:t xml:space="preserve">mark_entry_moble_app.py</w:t>
+            </w:r>
+          </w:p>
+        </w:tc>
+        <w:tc>
+          <w:tcPr/>
+          <w:p>
+            <w:pPr>
+              <w:pStyle w:val="Compact"/>
+              <w:jc w:val="left"/>
+            </w:pPr>
+            <w:r>
+              <w:rPr>
+                <w:rStyle w:val="VerbatimChar"/>
+              </w:rPr>
+              <w:t xml:space="preserve">mark_entry_moble_app.docx</w:t>
+            </w:r>
+          </w:p>
+        </w:tc>
+        <w:tc>
+          <w:tcPr/>
+          <w:p>
+            <w:pPr>
+              <w:pStyle w:val="Compact"/>
+              <w:jc w:val="left"/>
+            </w:pPr>
             <w:r>
               <w:rPr>
                 <w:iCs/>
@@ -740,6 +2368,33 @@
               </w:rPr>
               <w:t xml:space="preserve">(coming next)</w:t>
             </w:r>
+            <w:r>
+              <w:t xml:space="preserve"> </w:t>
+            </w:r>
+            <w:r>
+              <w:t xml:space="preserve">— the</w:t>
+            </w:r>
+            <w:r>
+              <w:t xml:space="preserve"> </w:t>
+            </w:r>
+            <w:r>
+              <w:t xml:space="preserve">current/live mobile mark</w:t>
+            </w:r>
+            <w:r>
+              <w:t xml:space="preserve"> </w:t>
+            </w:r>
+            <w:r>
+              <w:t xml:space="preserve">entry app, replacing</w:t>
+            </w:r>
+            <w:r>
+              <w:t xml:space="preserve"> </w:t>
+            </w:r>
+            <w:r>
+              <w:rPr>
+                <w:rStyle w:val="VerbatimChar"/>
+              </w:rPr>
+              <w:t xml:space="preserve">campmobile.py</w:t>
+            </w:r>
           </w:p>
         </w:tc>
       </w:tr>
@@ -755,23 +2410,32 @@
               <w:rPr>
                 <w:rStyle w:val="VerbatimChar"/>
               </w:rPr>
-              <w:t xml:space="preserve">chief-examiner-mark-view.md</w:t>
-            </w:r>
-          </w:p>
-        </w:tc>
-        <w:tc>
-          <w:tcPr/>
-          <w:p>
-            <w:pPr>
-              <w:pStyle w:val="Compact"/>
-              <w:jc w:val="left"/>
-            </w:pPr>
-            <w:r>
-              <w:t xml:space="preserve">Chief examiner mark view/update</w:t>
-            </w:r>
-            <w:r>
-              <w:t xml:space="preserve"> </w:t>
-            </w:r>
+              <w:t xml:space="preserve">smp_approve.py</w:t>
+            </w:r>
+          </w:p>
+        </w:tc>
+        <w:tc>
+          <w:tcPr/>
+          <w:p>
+            <w:pPr>
+              <w:pStyle w:val="Compact"/>
+              <w:jc w:val="left"/>
+            </w:pPr>
+            <w:r>
+              <w:rPr>
+                <w:rStyle w:val="VerbatimChar"/>
+              </w:rPr>
+              <w:t xml:space="preserve">smp_approve.docx</w:t>
+            </w:r>
+          </w:p>
+        </w:tc>
+        <w:tc>
+          <w:tcPr/>
+          <w:p>
+            <w:pPr>
+              <w:pStyle w:val="Compact"/>
+              <w:jc w:val="left"/>
+            </w:pPr>
             <w:r>
               <w:rPr>
                 <w:iCs/>
@@ -794,23 +2458,32 @@
               <w:rPr>
                 <w:rStyle w:val="VerbatimChar"/>
               </w:rPr>
-              <w:t xml:space="preserve">smp.md</w:t>
-            </w:r>
-          </w:p>
-        </w:tc>
-        <w:tc>
-          <w:tcPr/>
-          <w:p>
-            <w:pPr>
-              <w:pStyle w:val="Compact"/>
-              <w:jc w:val="left"/>
-            </w:pPr>
-            <w:r>
-              <w:t xml:space="preserve">Suspected Malpractice upload &amp; approval flow</w:t>
-            </w:r>
-            <w:r>
-              <w:t xml:space="preserve"> </w:t>
-            </w:r>
+              <w:t xml:space="preserve">smp_upload.py</w:t>
+            </w:r>
+          </w:p>
+        </w:tc>
+        <w:tc>
+          <w:tcPr/>
+          <w:p>
+            <w:pPr>
+              <w:pStyle w:val="Compact"/>
+              <w:jc w:val="left"/>
+            </w:pPr>
+            <w:r>
+              <w:rPr>
+                <w:rStyle w:val="VerbatimChar"/>
+              </w:rPr>
+              <w:t xml:space="preserve">smp_upload.docx</w:t>
+            </w:r>
+          </w:p>
+        </w:tc>
+        <w:tc>
+          <w:tcPr/>
+          <w:p>
+            <w:pPr>
+              <w:pStyle w:val="Compact"/>
+              <w:jc w:val="left"/>
+            </w:pPr>
             <w:r>
               <w:rPr>
                 <w:iCs/>
@@ -833,23 +2506,32 @@
               <w:rPr>
                 <w:rStyle w:val="VerbatimChar"/>
               </w:rPr>
-              <w:t xml:space="preserve">external-teacher-allocation.md</w:t>
-            </w:r>
-          </w:p>
-        </w:tc>
-        <w:tc>
-          <w:tcPr/>
-          <w:p>
-            <w:pPr>
-              <w:pStyle w:val="Compact"/>
-              <w:jc w:val="left"/>
-            </w:pPr>
-            <w:r>
-              <w:t xml:space="preserve">External teacher/examiner allocation</w:t>
-            </w:r>
-            <w:r>
-              <w:t xml:space="preserve"> </w:t>
-            </w:r>
+              <w:t xml:space="preserve">third_level_eligible_answersheet_report.py</w:t>
+            </w:r>
+          </w:p>
+        </w:tc>
+        <w:tc>
+          <w:tcPr/>
+          <w:p>
+            <w:pPr>
+              <w:pStyle w:val="Compact"/>
+              <w:jc w:val="left"/>
+            </w:pPr>
+            <w:r>
+              <w:rPr>
+                <w:rStyle w:val="VerbatimChar"/>
+              </w:rPr>
+              <w:t xml:space="preserve">third_level_eligible_answersheet_report.docx</w:t>
+            </w:r>
+          </w:p>
+        </w:tc>
+        <w:tc>
+          <w:tcPr/>
+          <w:p>
+            <w:pPr>
+              <w:pStyle w:val="Compact"/>
+              <w:jc w:val="left"/>
+            </w:pPr>
             <w:r>
               <w:rPr>
                 <w:iCs/>
@@ -872,23 +2554,32 @@
               <w:rPr>
                 <w:rStyle w:val="VerbatimChar"/>
               </w:rPr>
-              <w:t xml:space="preserve">zone-code-approval.md</w:t>
-            </w:r>
-          </w:p>
-        </w:tc>
-        <w:tc>
-          <w:tcPr/>
-          <w:p>
-            <w:pPr>
-              <w:pStyle w:val="Compact"/>
-              <w:jc w:val="left"/>
-            </w:pPr>
-            <w:r>
-              <w:t xml:space="preserve">Zone/coordinator mark approval</w:t>
-            </w:r>
-            <w:r>
-              <w:t xml:space="preserve"> </w:t>
-            </w:r>
+              <w:t xml:space="preserve">zonemarkapprove.py</w:t>
+            </w:r>
+          </w:p>
+        </w:tc>
+        <w:tc>
+          <w:tcPr/>
+          <w:p>
+            <w:pPr>
+              <w:pStyle w:val="Compact"/>
+              <w:jc w:val="left"/>
+            </w:pPr>
+            <w:r>
+              <w:rPr>
+                <w:rStyle w:val="VerbatimChar"/>
+              </w:rPr>
+              <w:t xml:space="preserve">zonemarkapprove.docx</w:t>
+            </w:r>
+          </w:p>
+        </w:tc>
+        <w:tc>
+          <w:tcPr/>
+          <w:p>
+            <w:pPr>
+              <w:pStyle w:val="Compact"/>
+              <w:jc w:val="left"/>
+            </w:pPr>
             <w:r>
               <w:rPr>
                 <w:iCs/>
@@ -899,56 +2590,1467 @@
           </w:p>
         </w:tc>
       </w:tr>
-      <w:tr>
-        <w:tc>
-          <w:tcPr/>
-          <w:p>
-            <w:pPr>
-              <w:pStyle w:val="Compact"/>
-              <w:jc w:val="left"/>
-            </w:pPr>
-            <w:r>
-              <w:rPr>
-                <w:rStyle w:val="VerbatimChar"/>
-              </w:rPr>
-              <w:t xml:space="preserve">camp-closure-cellar-disposal.md</w:t>
-            </w:r>
-          </w:p>
-        </w:tc>
-        <w:tc>
-          <w:tcPr/>
-          <w:p>
-            <w:pPr>
-              <w:pStyle w:val="Compact"/>
-              <w:jc w:val="left"/>
-            </w:pPr>
-            <w:r>
-              <w:t xml:space="preserve">Camp closure, cellar inventory, answer sheet disposal</w:t>
-            </w:r>
-            <w:r>
-              <w:t xml:space="preserve"> </w:t>
-            </w:r>
-            <w:r>
-              <w:rPr>
-                <w:iCs/>
-                <w:i/>
-              </w:rPr>
-              <w:t xml:space="preserve">(coming next)</w:t>
-            </w:r>
-          </w:p>
-        </w:tc>
-      </w:tr>
     </w:tbl>
+    <w:bookmarkEnd w:id="22"/>
+    <w:bookmarkStart w:id="23" w:name="highest-priority-bugs-found-so-far"/>
+    <w:p>
+      <w:pPr>
+        <w:pStyle w:val="Heading2"/>
+      </w:pPr>
+      <w:r>
+        <w:t xml:space="preserve">🔴 Highest-priority bugs found so far</w:t>
+      </w:r>
+    </w:p>
+    <w:p>
+      <w:pPr>
+        <w:numPr>
+          <w:ilvl w:val="0"/>
+          <w:numId w:val="1002"/>
+        </w:numPr>
+        <w:pStyle w:val="Compact"/>
+      </w:pPr>
+      <w:r>
+        <w:rPr>
+          <w:rStyle w:val="VerbatimChar"/>
+        </w:rPr>
+        <w:t xml:space="preserve">disposlist.py</w:t>
+      </w:r>
+      <w:r>
+        <w:t xml:space="preserve">’s</w:t>
+      </w:r>
+      <w:r>
+        <w:t xml:space="preserve"> </w:t>
+      </w:r>
+      <w:r>
+        <w:rPr>
+          <w:rStyle w:val="VerbatimChar"/>
+        </w:rPr>
+        <w:t xml:space="preserve">DisposalSubmit.post()</w:t>
+      </w:r>
+      <w:r>
+        <w:t xml:space="preserve"> </w:t>
+      </w:r>
+      <w:r>
+        <w:t xml:space="preserve">— the five delete</w:t>
+      </w:r>
+      <w:r>
+        <w:t xml:space="preserve"> </w:t>
+      </w:r>
+      <w:r>
+        <w:t xml:space="preserve">statements meant to run once per submitted bundle code are indented</w:t>
+      </w:r>
+      <w:r>
+        <w:t xml:space="preserve"> </w:t>
+      </w:r>
+      <w:r>
+        <w:t xml:space="preserve">outside the</w:t>
+      </w:r>
+      <w:r>
+        <w:t xml:space="preserve"> </w:t>
+      </w:r>
+      <w:r>
+        <w:rPr>
+          <w:rStyle w:val="VerbatimChar"/>
+        </w:rPr>
+        <w:t xml:space="preserve">for</w:t>
+      </w:r>
+      <w:r>
+        <w:t xml:space="preserve"> </w:t>
+      </w:r>
+      <w:r>
+        <w:t xml:space="preserve">loop, so</w:t>
+      </w:r>
+      <w:r>
+        <w:t xml:space="preserve"> </w:t>
+      </w:r>
+      <w:r>
+        <w:rPr>
+          <w:bCs/>
+          <w:b/>
+        </w:rPr>
+        <w:t xml:space="preserve">only the last bundle in a batch</w:t>
+      </w:r>
+      <w:r>
+        <w:rPr>
+          <w:bCs/>
+          <w:b/>
+        </w:rPr>
+        <w:t xml:space="preserve"> </w:t>
+      </w:r>
+      <w:r>
+        <w:rPr>
+          <w:bCs/>
+          <w:b/>
+        </w:rPr>
+        <w:t xml:space="preserve">actually gets its records deleted</w:t>
+      </w:r>
+      <w:r>
+        <w:t xml:space="preserve"> </w:t>
+      </w:r>
+      <w:r>
+        <w:t xml:space="preserve">— the rest are silently left</w:t>
+      </w:r>
+      <w:r>
+        <w:t xml:space="preserve"> </w:t>
+      </w:r>
+      <w:r>
+        <w:t xml:space="preserve">in the database while the response still reports full success. The</w:t>
+      </w:r>
+      <w:r>
+        <w:t xml:space="preserve"> </w:t>
+      </w:r>
+      <w:r>
+        <w:t xml:space="preserve">same function also</w:t>
+      </w:r>
+      <w:r>
+        <w:t xml:space="preserve"> </w:t>
+      </w:r>
+      <w:r>
+        <w:t xml:space="preserve">“</w:t>
+      </w:r>
+      <w:r>
+        <w:t xml:space="preserve">nullifies</w:t>
+      </w:r>
+      <w:r>
+        <w:t xml:space="preserve">”</w:t>
+      </w:r>
+      <w:r>
+        <w:t xml:space="preserve"> </w:t>
+      </w:r>
+      <w:r>
+        <w:t xml:space="preserve">a</w:t>
+      </w:r>
+      <w:r>
+        <w:t xml:space="preserve"> </w:t>
+      </w:r>
+      <w:r>
+        <w:rPr>
+          <w:rStyle w:val="VerbatimChar"/>
+        </w:rPr>
+        <w:t xml:space="preserve">BundleExaminer</w:t>
+      </w:r>
+      <w:r>
+        <w:t xml:space="preserve"> </w:t>
+      </w:r>
+      <w:r>
+        <w:t xml:space="preserve">record by setting</w:t>
+      </w:r>
+      <w:r>
+        <w:t xml:space="preserve"> </w:t>
+      </w:r>
+      <w:r>
+        <w:rPr>
+          <w:rStyle w:val="VerbatimChar"/>
+        </w:rPr>
+        <w:t xml:space="preserve">.id = None</w:t>
+      </w:r>
+      <w:r>
+        <w:t xml:space="preserve"> </w:t>
+      </w:r>
+      <w:r>
+        <w:t xml:space="preserve">and saving, which in Django actually</w:t>
+      </w:r>
+      <w:r>
+        <w:t xml:space="preserve"> </w:t>
+      </w:r>
+      <w:r>
+        <w:rPr>
+          <w:bCs/>
+          <w:b/>
+        </w:rPr>
+        <w:t xml:space="preserve">clones</w:t>
+      </w:r>
+      <w:r>
+        <w:t xml:space="preserve"> </w:t>
+      </w:r>
+      <w:r>
+        <w:t xml:space="preserve">the row</w:t>
+      </w:r>
+      <w:r>
+        <w:t xml:space="preserve"> </w:t>
+      </w:r>
+      <w:r>
+        <w:t xml:space="preserve">rather than detaching it, silently leaving duplicate rows behind.</w:t>
+      </w:r>
+      <w:r>
+        <w:t xml:space="preserve"> </w:t>
+      </w:r>
+      <w:r>
+        <w:t xml:space="preserve">Both bugs matter because this endpoint permanently deletes data —</w:t>
+      </w:r>
+      <w:r>
+        <w:t xml:space="preserve"> </w:t>
+      </w:r>
+      <w:r>
+        <w:t xml:space="preserve">see</w:t>
+      </w:r>
+      <w:r>
+        <w:t xml:space="preserve"> </w:t>
+      </w:r>
+      <w:r>
+        <w:rPr>
+          <w:rStyle w:val="VerbatimChar"/>
+        </w:rPr>
+        <w:t xml:space="preserve">disposlist.md</w:t>
+      </w:r>
+      <w:r>
+        <w:t xml:space="preserve"> </w:t>
+      </w:r>
+      <w:r>
+        <w:t xml:space="preserve">endpoint #2 for detail.</w:t>
+      </w:r>
+    </w:p>
+    <w:p>
+      <w:pPr>
+        <w:numPr>
+          <w:ilvl w:val="0"/>
+          <w:numId w:val="1002"/>
+        </w:numPr>
+        <w:pStyle w:val="Compact"/>
+      </w:pPr>
+      <w:r>
+        <w:rPr>
+          <w:rStyle w:val="VerbatimChar"/>
+        </w:rPr>
+        <w:t xml:space="preserve">direct_bundle_dist.py</w:t>
+      </w:r>
+      <w:r>
+        <w:t xml:space="preserve">’s</w:t>
+      </w:r>
+      <w:r>
+        <w:t xml:space="preserve"> </w:t>
+      </w:r>
+      <w:r>
+        <w:rPr>
+          <w:rStyle w:val="VerbatimChar"/>
+        </w:rPr>
+        <w:t xml:space="preserve">DirectDistributionList.post()</w:t>
+      </w:r>
+      <w:r>
+        <w:t xml:space="preserve"> </w:t>
+      </w:r>
+      <w:r>
+        <w:t xml:space="preserve">— a</w:t>
+      </w:r>
+      <w:r>
+        <w:t xml:space="preserve"> </w:t>
+      </w:r>
+      <w:r>
+        <w:t xml:space="preserve">duplicate-distribution guard is computed correctly and then</w:t>
+      </w:r>
+      <w:r>
+        <w:t xml:space="preserve"> </w:t>
+      </w:r>
+      <w:r>
+        <w:t xml:space="preserve">immediately overwritten with</w:t>
+      </w:r>
+      <w:r>
+        <w:t xml:space="preserve"> </w:t>
+      </w:r>
+      <w:r>
+        <w:rPr>
+          <w:rStyle w:val="VerbatimChar"/>
+        </w:rPr>
+        <w:t xml:space="preserve">bundleexaminercheck = False</w:t>
+      </w:r>
+      <w:r>
+        <w:t xml:space="preserve"> </w:t>
+      </w:r>
+      <w:r>
+        <w:t xml:space="preserve">on the</w:t>
+      </w:r>
+      <w:r>
+        <w:t xml:space="preserve"> </w:t>
+      </w:r>
+      <w:r>
+        <w:t xml:space="preserve">very next line, so a bundle can currently be allocated to more than</w:t>
+      </w:r>
+      <w:r>
+        <w:t xml:space="preserve"> </w:t>
+      </w:r>
+      <w:r>
+        <w:t xml:space="preserve">one first-level examiner with nothing stopping it. See</w:t>
+      </w:r>
+      <w:r>
+        <w:t xml:space="preserve"> </w:t>
+      </w:r>
+      <w:r>
+        <w:rPr>
+          <w:rStyle w:val="VerbatimChar"/>
+        </w:rPr>
+        <w:t xml:space="preserve">direct-bundle-dist.md</w:t>
+      </w:r>
+      <w:r>
+        <w:t xml:space="preserve"> </w:t>
+      </w:r>
+      <w:r>
+        <w:t xml:space="preserve">endpoint #1.</w:t>
+      </w:r>
+    </w:p>
+    <w:p>
+      <w:pPr>
+        <w:numPr>
+          <w:ilvl w:val="0"/>
+          <w:numId w:val="1002"/>
+        </w:numPr>
+        <w:pStyle w:val="Compact"/>
+      </w:pPr>
+      <w:r>
+        <w:rPr>
+          <w:rStyle w:val="VerbatimChar"/>
+        </w:rPr>
+        <w:t xml:space="preserve">mark_approve.py</w:t>
+      </w:r>
+      <w:r>
+        <w:t xml:space="preserve">’s</w:t>
+      </w:r>
+      <w:r>
+        <w:t xml:space="preserve"> </w:t>
+      </w:r>
+      <w:r>
+        <w:rPr>
+          <w:rStyle w:val="VerbatimChar"/>
+        </w:rPr>
+        <w:t xml:space="preserve">MarkUpdateStudentMark.post()</w:t>
+      </w:r>
+      <w:r>
+        <w:t xml:space="preserve"> </w:t>
+      </w:r>
+      <w:r>
+        <w:t xml:space="preserve">— the</w:t>
+      </w:r>
+      <w:r>
+        <w:t xml:space="preserve"> </w:t>
+      </w:r>
+      <w:r>
+        <w:t xml:space="preserve">endpoint that actually overrides a candidate’s official mark has</w:t>
+      </w:r>
+      <w:r>
+        <w:t xml:space="preserve"> </w:t>
+      </w:r>
+      <w:r>
+        <w:rPr>
+          <w:bCs/>
+          <w:b/>
+        </w:rPr>
+        <w:t xml:space="preserve">no role/permission check at all</w:t>
+      </w:r>
+      <w:r>
+        <w:t xml:space="preserve">, even though every sibling</w:t>
+      </w:r>
+      <w:r>
+        <w:t xml:space="preserve"> </w:t>
+      </w:r>
+      <w:r>
+        <w:t xml:space="preserve">list/drill-down endpoint in the same file correctly restricts to</w:t>
+      </w:r>
+      <w:r>
+        <w:t xml:space="preserve"> </w:t>
+      </w:r>
+      <w:r>
+        <w:t xml:space="preserve">Chairman/Deputy Chairman. Any authenticated user who can supply a</w:t>
+      </w:r>
+      <w:r>
+        <w:t xml:space="preserve"> </w:t>
+      </w:r>
+      <w:r>
+        <w:t xml:space="preserve">valid</w:t>
+      </w:r>
+      <w:r>
+        <w:t xml:space="preserve"> </w:t>
+      </w:r>
+      <w:r>
+        <w:rPr>
+          <w:rStyle w:val="VerbatimChar"/>
+        </w:rPr>
+        <w:t xml:space="preserve">exr_dfm_id</w:t>
+      </w:r>
+      <w:r>
+        <w:t xml:space="preserve"> </w:t>
+      </w:r>
+      <w:r>
+        <w:t xml:space="preserve">can change that candidate’s mark. The same</w:t>
+      </w:r>
+      <w:r>
+        <w:t xml:space="preserve"> </w:t>
+      </w:r>
+      <w:r>
+        <w:t xml:space="preserve">endpoint also leaves the audit-trail fields</w:t>
+      </w:r>
+      <w:r>
+        <w:t xml:space="preserve"> </w:t>
+      </w:r>
+      <w:r>
+        <w:t xml:space="preserve">(</w:t>
+      </w:r>
+      <w:r>
+        <w:rPr>
+          <w:rStyle w:val="VerbatimChar"/>
+        </w:rPr>
+        <w:t xml:space="preserve">comments</w:t>
+      </w:r>
+      <w:r>
+        <w:t xml:space="preserve">/</w:t>
+      </w:r>
+      <w:r>
+        <w:rPr>
+          <w:rStyle w:val="VerbatimChar"/>
+        </w:rPr>
+        <w:t xml:space="preserve">updated_by</w:t>
+      </w:r>
+      <w:r>
+        <w:t xml:space="preserve">) commented out on exactly the record that</w:t>
+      </w:r>
+      <w:r>
+        <w:t xml:space="preserve"> </w:t>
+      </w:r>
+      <w:r>
+        <w:t xml:space="preserve">should always be traceable to a person. See</w:t>
+      </w:r>
+      <w:r>
+        <w:t xml:space="preserve"> </w:t>
+      </w:r>
+      <w:r>
+        <w:rPr>
+          <w:rStyle w:val="VerbatimChar"/>
+        </w:rPr>
+        <w:t xml:space="preserve">mark_approve.docx</w:t>
+      </w:r>
+      <w:r>
+        <w:t xml:space="preserve"> </w:t>
+      </w:r>
+      <w:r>
+        <w:t xml:space="preserve">endpoint #11.</w:t>
+      </w:r>
+    </w:p>
+    <w:p>
+      <w:pPr>
+        <w:pStyle w:val="FirstParagraph"/>
+      </w:pPr>
+      <w:r>
+        <w:t xml:space="preserve">These three are true data-integrity/access-control risks, worth</w:t>
+      </w:r>
+      <w:r>
+        <w:t xml:space="preserve"> </w:t>
+      </w:r>
+      <w:r>
+        <w:t xml:space="preserve">prioritizing over the other flagged issues below, which are mostly</w:t>
+      </w:r>
+      <w:r>
+        <w:t xml:space="preserve"> </w:t>
+      </w:r>
+      <w:r>
+        <w:t xml:space="preserve">error-handling/consistency concerns rather than incorrect data being</w:t>
+      </w:r>
+      <w:r>
+        <w:t xml:space="preserve"> </w:t>
+      </w:r>
+      <w:r>
+        <w:t xml:space="preserve">silently written, deleted, or changed by the wrong person.</w:t>
+      </w:r>
+    </w:p>
+    <w:bookmarkEnd w:id="23"/>
+    <w:bookmarkStart w:id="24" w:name="security-concern"/>
+    <w:p>
+      <w:pPr>
+        <w:pStyle w:val="Heading2"/>
+      </w:pPr>
+      <w:r>
+        <w:t xml:space="preserve">🔴 Security concern</w:t>
+      </w:r>
+    </w:p>
+    <w:p>
+      <w:pPr>
+        <w:pStyle w:val="FirstParagraph"/>
+      </w:pPr>
+      <w:r>
+        <w:rPr>
+          <w:rStyle w:val="VerbatimChar"/>
+        </w:rPr>
+        <w:t xml:space="preserve">extmark_entry.py</w:t>
+      </w:r>
+      <w:r>
+        <w:t xml:space="preserve">’s</w:t>
+      </w:r>
+      <w:r>
+        <w:t xml:space="preserve"> </w:t>
+      </w:r>
+      <w:r>
+        <w:rPr>
+          <w:rStyle w:val="VerbatimChar"/>
+        </w:rPr>
+        <w:t xml:space="preserve">ExtMarkEntry.post()</w:t>
+      </w:r>
+      <w:r>
+        <w:t xml:space="preserve"> </w:t>
+      </w:r>
+      <w:r>
+        <w:t xml:space="preserve">uses</w:t>
+      </w:r>
+      <w:r>
+        <w:t xml:space="preserve"> </w:t>
+      </w:r>
+      <w:r>
+        <w:rPr>
+          <w:rStyle w:val="VerbatimChar"/>
+        </w:rPr>
+        <w:t xml:space="preserve">eval()</w:t>
+      </w:r>
+      <w:r>
+        <w:t xml:space="preserve"> </w:t>
+      </w:r>
+      <w:r>
+        <w:t xml:space="preserve">to convert a</w:t>
+      </w:r>
+      <w:r>
+        <w:t xml:space="preserve"> </w:t>
+      </w:r>
+      <w:r>
+        <w:t xml:space="preserve">stored string back into bytes before decrypting it</w:t>
+      </w:r>
+      <w:r>
+        <w:t xml:space="preserve"> </w:t>
+      </w:r>
+      <w:r>
+        <w:t xml:space="preserve">(</w:t>
+      </w:r>
+      <w:r>
+        <w:rPr>
+          <w:rStyle w:val="VerbatimChar"/>
+        </w:rPr>
+        <w:t xml:space="preserve">internal_mark2 = eval(internal_mark2)</w:t>
+      </w:r>
+      <w:r>
+        <w:t xml:space="preserve">).</w:t>
+      </w:r>
+      <w:r>
+        <w:t xml:space="preserve"> </w:t>
+      </w:r>
+      <w:r>
+        <w:rPr>
+          <w:rStyle w:val="VerbatimChar"/>
+        </w:rPr>
+        <w:t xml:space="preserve">eval()</w:t>
+      </w:r>
+      <w:r>
+        <w:t xml:space="preserve"> </w:t>
+      </w:r>
+      <w:r>
+        <w:t xml:space="preserve">executes arbitrary</w:t>
+      </w:r>
+      <w:r>
+        <w:t xml:space="preserve"> </w:t>
+      </w:r>
+      <w:r>
+        <w:t xml:space="preserve">Python code, not just bytes literals — if that stored value is ever</w:t>
+      </w:r>
+      <w:r>
+        <w:t xml:space="preserve"> </w:t>
+      </w:r>
+      <w:r>
+        <w:t xml:space="preserve">anything other than exactly what your own code wrote there, this is a</w:t>
+      </w:r>
+      <w:r>
+        <w:t xml:space="preserve"> </w:t>
+      </w:r>
+      <w:r>
+        <w:t xml:space="preserve">code-execution risk, not just a style issue. Safe replacement:</w:t>
+      </w:r>
+      <w:r>
+        <w:t xml:space="preserve"> </w:t>
+      </w:r>
+      <w:r>
+        <w:rPr>
+          <w:rStyle w:val="VerbatimChar"/>
+        </w:rPr>
+        <w:t xml:space="preserve">ast.literal_eval(...)</w:t>
+      </w:r>
+      <w:r>
+        <w:t xml:space="preserve">. See</w:t>
+      </w:r>
+      <w:r>
+        <w:t xml:space="preserve"> </w:t>
+      </w:r>
+      <w:r>
+        <w:rPr>
+          <w:rStyle w:val="VerbatimChar"/>
+        </w:rPr>
+        <w:t xml:space="preserve">extmark_entry.docx</w:t>
+      </w:r>
+      <w:r>
+        <w:t xml:space="preserve"> </w:t>
+      </w:r>
+      <w:r>
+        <w:t xml:space="preserve">endpoint #6 for detail</w:t>
+      </w:r>
+      <w:r>
+        <w:t xml:space="preserve"> </w:t>
+      </w:r>
+      <w:r>
+        <w:t xml:space="preserve">— worth a security review, not just a cleanup pass.</w:t>
+      </w:r>
+    </w:p>
+    <w:bookmarkEnd w:id="24"/>
+    <w:bookmarkStart w:id="25" w:name="X56fb79437223fd5bc97af8577adf14c3eb4032e"/>
+    <w:p>
+      <w:pPr>
+        <w:pStyle w:val="Heading2"/>
+      </w:pPr>
+      <w:r>
+        <w:t xml:space="preserve">Recurring issues worth a dedicated cleanup pass</w:t>
+      </w:r>
+    </w:p>
+    <w:p>
+      <w:pPr>
+        <w:pStyle w:val="FirstParagraph"/>
+      </w:pPr>
+      <w:r>
+        <w:t xml:space="preserve">A few patterns have shown up across multiple files, noted here so</w:t>
+      </w:r>
+      <w:r>
+        <w:t xml:space="preserve"> </w:t>
+      </w:r>
+      <w:r>
+        <w:t xml:space="preserve">they’re visible in one place instead of only buried in individual docs:</w:t>
+      </w:r>
+    </w:p>
+    <w:p>
+      <w:pPr>
+        <w:numPr>
+          <w:ilvl w:val="0"/>
+          <w:numId w:val="1003"/>
+        </w:numPr>
+        <w:pStyle w:val="Compact"/>
+      </w:pPr>
+      <w:r>
+        <w:rPr>
+          <w:bCs/>
+          <w:b/>
+        </w:rPr>
+        <w:t xml:space="preserve">Duplicate URL registrations</w:t>
+      </w:r>
+      <w:r>
+        <w:t xml:space="preserve"> </w:t>
+      </w:r>
+      <w:r>
+        <w:t xml:space="preserve">— most files so far have every</w:t>
+      </w:r>
+      <w:r>
+        <w:t xml:space="preserve"> </w:t>
+      </w:r>
+      <w:r>
+        <w:t xml:space="preserve">endpoint registered twice in</w:t>
+      </w:r>
+      <w:r>
+        <w:t xml:space="preserve"> </w:t>
+      </w:r>
+      <w:r>
+        <w:rPr>
+          <w:rStyle w:val="VerbatimChar"/>
+        </w:rPr>
+        <w:t xml:space="preserve">urls.py</w:t>
+      </w:r>
+      <w:r>
+        <w:t xml:space="preserve"> </w:t>
+      </w:r>
+      <w:r>
+        <w:t xml:space="preserve">with identical paths/names</w:t>
+      </w:r>
+      <w:r>
+        <w:t xml:space="preserve"> </w:t>
+      </w:r>
+      <w:r>
+        <w:t xml:space="preserve">(harmless, but dead weight).</w:t>
+      </w:r>
+    </w:p>
+    <w:p>
+      <w:pPr>
+        <w:numPr>
+          <w:ilvl w:val="0"/>
+          <w:numId w:val="1003"/>
+        </w:numPr>
+        <w:pStyle w:val="Compact"/>
+      </w:pPr>
+      <w:r>
+        <w:rPr>
+          <w:bCs/>
+          <w:b/>
+        </w:rPr>
+        <w:t xml:space="preserve">Unguarded</w:t>
+      </w:r>
+      <w:r>
+        <w:t xml:space="preserve"> </w:t>
+      </w:r>
+      <w:r>
+        <w:rPr>
+          <w:rStyle w:val="VerbatimChar"/>
+        </w:rPr>
+        <w:t xml:space="preserve">.first()</w:t>
+      </w:r>
+      <w:r>
+        <w:rPr>
+          <w:bCs/>
+          <w:b/>
+        </w:rPr>
+        <w:t xml:space="preserve">/</w:t>
+      </w:r>
+      <w:r>
+        <w:rPr>
+          <w:rStyle w:val="VerbatimChar"/>
+        </w:rPr>
+        <w:t xml:space="preserve">.last()</w:t>
+      </w:r>
+      <w:r>
+        <w:t xml:space="preserve"> </w:t>
+      </w:r>
+      <w:r>
+        <w:rPr>
+          <w:bCs/>
+          <w:b/>
+        </w:rPr>
+        <w:t xml:space="preserve">chains</w:t>
+      </w:r>
+      <w:r>
+        <w:t xml:space="preserve"> </w:t>
+      </w:r>
+      <w:r>
+        <w:t xml:space="preserve">— many endpoints</w:t>
+      </w:r>
+      <w:r>
+        <w:t xml:space="preserve"> </w:t>
+      </w:r>
+      <w:r>
+        <w:t xml:space="preserve">walk deep model chains without checking for</w:t>
+      </w:r>
+      <w:r>
+        <w:t xml:space="preserve"> </w:t>
+      </w:r>
+      <w:r>
+        <w:rPr>
+          <w:rStyle w:val="VerbatimChar"/>
+        </w:rPr>
+        <w:t xml:space="preserve">None</w:t>
+      </w:r>
+      <w:r>
+        <w:t xml:space="preserve"> </w:t>
+      </w:r>
+      <w:r>
+        <w:t xml:space="preserve">at each step, so</w:t>
+      </w:r>
+      <w:r>
+        <w:t xml:space="preserve"> </w:t>
+      </w:r>
+      <w:r>
+        <w:t xml:space="preserve">a missing record anywhere in the chain surfaces as the same generic</w:t>
+      </w:r>
+      <w:r>
+        <w:t xml:space="preserve"> </w:t>
+      </w:r>
+      <w:r>
+        <w:rPr>
+          <w:rStyle w:val="VerbatimChar"/>
+        </w:rPr>
+        <w:t xml:space="preserve">BAD_GATEWAY</w:t>
+      </w:r>
+      <w:r>
+        <w:t xml:space="preserve"> </w:t>
+      </w:r>
+      <w:r>
+        <w:t xml:space="preserve">error rather than a specific</w:t>
+      </w:r>
+      <w:r>
+        <w:t xml:space="preserve"> </w:t>
+      </w:r>
+      <w:r>
+        <w:t xml:space="preserve">“</w:t>
+      </w:r>
+      <w:r>
+        <w:t xml:space="preserve">not found</w:t>
+      </w:r>
+      <w:r>
+        <w:t xml:space="preserve">”</w:t>
+      </w:r>
+      <w:r>
+        <w:t xml:space="preserve"> </w:t>
+      </w:r>
+      <w:r>
+        <w:t xml:space="preserve">message.</w:t>
+      </w:r>
+    </w:p>
+    <w:p>
+      <w:pPr>
+        <w:numPr>
+          <w:ilvl w:val="0"/>
+          <w:numId w:val="1003"/>
+        </w:numPr>
+        <w:pStyle w:val="Compact"/>
+      </w:pPr>
+      <w:r>
+        <w:rPr>
+          <w:rStyle w:val="VerbatimChar"/>
+        </w:rPr>
+        <w:t xml:space="preserve">message={}</w:t>
+      </w:r>
+      <w:r>
+        <w:t xml:space="preserve"> </w:t>
+      </w:r>
+      <w:r>
+        <w:rPr>
+          <w:bCs/>
+          <w:b/>
+        </w:rPr>
+        <w:t xml:space="preserve">instead of a string</w:t>
+      </w:r>
+      <w:r>
+        <w:t xml:space="preserve">, and missing</w:t>
+      </w:r>
+      <w:r>
+        <w:t xml:space="preserve"> </w:t>
+      </w:r>
+      <w:r>
+        <w:rPr>
+          <w:rStyle w:val="VerbatimChar"/>
+        </w:rPr>
+        <w:t xml:space="preserve">status_code</w:t>
+      </w:r>
+      <w:r>
+        <w:t xml:space="preserve">, on</w:t>
+      </w:r>
+      <w:r>
+        <w:t xml:space="preserve"> </w:t>
+      </w:r>
+      <w:r>
+        <w:t xml:space="preserve">some early-exit branches (</w:t>
+      </w:r>
+      <w:r>
+        <w:rPr>
+          <w:rStyle w:val="VerbatimChar"/>
+        </w:rPr>
+        <w:t xml:space="preserve">campmarklist.py</w:t>
+      </w:r>
+      <w:r>
+        <w:t xml:space="preserve">,</w:t>
+      </w:r>
+      <w:r>
+        <w:t xml:space="preserve"> </w:t>
+      </w:r>
+      <w:r>
+        <w:rPr>
+          <w:rStyle w:val="VerbatimChar"/>
+        </w:rPr>
+        <w:t xml:space="preserve">chief_mark_view.py</w:t>
+      </w:r>
+      <w:r>
+        <w:t xml:space="preserve">).</w:t>
+      </w:r>
+    </w:p>
+    <w:p>
+      <w:pPr>
+        <w:numPr>
+          <w:ilvl w:val="0"/>
+          <w:numId w:val="1003"/>
+        </w:numPr>
+        <w:pStyle w:val="Compact"/>
+      </w:pPr>
+      <w:r>
+        <w:rPr>
+          <w:rStyle w:val="VerbatimChar"/>
+        </w:rPr>
+        <w:t xml:space="preserve">data</w:t>
+      </w:r>
+      <w:r>
+        <w:t xml:space="preserve"> </w:t>
+      </w:r>
+      <w:r>
+        <w:rPr>
+          <w:bCs/>
+          <w:b/>
+        </w:rPr>
+        <w:t xml:space="preserve">passed as a Python</w:t>
+      </w:r>
+      <w:r>
+        <w:t xml:space="preserve"> </w:t>
+      </w:r>
+      <w:r>
+        <w:rPr>
+          <w:rStyle w:val="VerbatimChar"/>
+        </w:rPr>
+        <w:t xml:space="preserve">set</w:t>
+      </w:r>
+      <w:r>
+        <w:t xml:space="preserve"> </w:t>
+      </w:r>
+      <w:r>
+        <w:rPr>
+          <w:bCs/>
+          <w:b/>
+        </w:rPr>
+        <w:t xml:space="preserve">instead of a dict</w:t>
+      </w:r>
+      <w:r>
+        <w:t xml:space="preserve"> </w:t>
+      </w:r>
+      <w:r>
+        <w:t xml:space="preserve">—</w:t>
+      </w:r>
+      <w:r>
+        <w:t xml:space="preserve"> </w:t>
+      </w:r>
+      <w:r>
+        <w:rPr>
+          <w:rStyle w:val="VerbatimChar"/>
+        </w:rPr>
+        <w:t xml:space="preserve">data={"message"}</w:t>
+      </w:r>
+      <w:r>
+        <w:t xml:space="preserve"> </w:t>
+      </w:r>
+      <w:r>
+        <w:t xml:space="preserve">(no colon) appears in</w:t>
+      </w:r>
+      <w:r>
+        <w:t xml:space="preserve"> </w:t>
+      </w:r>
+      <w:r>
+        <w:rPr>
+          <w:bCs/>
+          <w:b/>
+        </w:rPr>
+        <w:t xml:space="preserve">three separate files</w:t>
+      </w:r>
+      <w:r>
+        <w:t xml:space="preserve"> </w:t>
+      </w:r>
+      <w:r>
+        <w:t xml:space="preserve">now:</w:t>
+      </w:r>
+      <w:r>
+        <w:t xml:space="preserve"> </w:t>
+      </w:r>
+      <w:r>
+        <w:rPr>
+          <w:rStyle w:val="VerbatimChar"/>
+        </w:rPr>
+        <w:t xml:space="preserve">campclosure.py</w:t>
+      </w:r>
+      <w:r>
+        <w:t xml:space="preserve">’s</w:t>
+      </w:r>
+      <w:r>
+        <w:t xml:space="preserve"> </w:t>
+      </w:r>
+      <w:r>
+        <w:rPr>
+          <w:rStyle w:val="VerbatimChar"/>
+        </w:rPr>
+        <w:t xml:space="preserve">CellarStorage</w:t>
+      </w:r>
+      <w:r>
+        <w:t xml:space="preserve">,</w:t>
+      </w:r>
+      <w:r>
+        <w:t xml:space="preserve"> </w:t>
+      </w:r>
+      <w:r>
+        <w:rPr>
+          <w:rStyle w:val="VerbatimChar"/>
+        </w:rPr>
+        <w:t xml:space="preserve">disposlist.py</w:t>
+      </w:r>
+      <w:r>
+        <w:t xml:space="preserve">’s</w:t>
+      </w:r>
+      <w:r>
+        <w:t xml:space="preserve"> </w:t>
+      </w:r>
+      <w:r>
+        <w:rPr>
+          <w:rStyle w:val="VerbatimChar"/>
+        </w:rPr>
+        <w:t xml:space="preserve">DisposalSubmit</w:t>
+      </w:r>
+      <w:r>
+        <w:t xml:space="preserve">, and</w:t>
+      </w:r>
+      <w:r>
+        <w:t xml:space="preserve"> </w:t>
+      </w:r>
+      <w:r>
+        <w:rPr>
+          <w:rStyle w:val="VerbatimChar"/>
+        </w:rPr>
+        <w:t xml:space="preserve">exttchr_allocation.py</w:t>
+      </w:r>
+      <w:r>
+        <w:t xml:space="preserve">’s</w:t>
+      </w:r>
+      <w:r>
+        <w:t xml:space="preserve"> </w:t>
+      </w:r>
+      <w:r>
+        <w:rPr>
+          <w:rStyle w:val="VerbatimChar"/>
+        </w:rPr>
+        <w:t xml:space="preserve">ExtProgramAllocation</w:t>
+      </w:r>
+      <w:r>
+        <w:t xml:space="preserve"> </w:t>
+      </w:r>
+      <w:r>
+        <w:t xml:space="preserve">— clearly copy-pasted from one to the next</w:t>
+      </w:r>
+      <w:r>
+        <w:t xml:space="preserve"> </w:t>
+      </w:r>
+      <w:r>
+        <w:t xml:space="preserve">without being caught. Worth a single find-and-fix pass across the</w:t>
+      </w:r>
+      <w:r>
+        <w:t xml:space="preserve"> </w:t>
+      </w:r>
+      <w:r>
+        <w:t xml:space="preserve">whole module rather than patching each one individually.</w:t>
+      </w:r>
+    </w:p>
+    <w:p>
+      <w:pPr>
+        <w:numPr>
+          <w:ilvl w:val="0"/>
+          <w:numId w:val="1003"/>
+        </w:numPr>
+        <w:pStyle w:val="Compact"/>
+      </w:pPr>
+      <w:r>
+        <w:rPr>
+          <w:bCs/>
+          <w:b/>
+        </w:rPr>
+        <w:t xml:space="preserve">Duplicated lookup/report logic between sibling endpoints</w:t>
+      </w:r>
+      <w:r>
+        <w:t xml:space="preserve"> </w:t>
+      </w:r>
+      <w:r>
+        <w:t xml:space="preserve">that</w:t>
+      </w:r>
+      <w:r>
+        <w:t xml:space="preserve"> </w:t>
+      </w:r>
+      <w:r>
+        <w:t xml:space="preserve">has already drifted apart in behavior in at least one case</w:t>
+      </w:r>
+      <w:r>
+        <w:t xml:space="preserve"> </w:t>
+      </w:r>
+      <w:r>
+        <w:t xml:space="preserve">(</w:t>
+      </w:r>
+      <w:r>
+        <w:rPr>
+          <w:rStyle w:val="VerbatimChar"/>
+        </w:rPr>
+        <w:t xml:space="preserve">cellar_inventory.py</w:t>
+      </w:r>
+      <w:r>
+        <w:t xml:space="preserve">’s two lookup endpoints disagree on how to</w:t>
+      </w:r>
+      <w:r>
+        <w:t xml:space="preserve"> </w:t>
+      </w:r>
+      <w:r>
+        <w:t xml:space="preserve">handle a bundle with no rack yet).</w:t>
+      </w:r>
+    </w:p>
+    <w:p>
+      <w:pPr>
+        <w:numPr>
+          <w:ilvl w:val="0"/>
+          <w:numId w:val="1003"/>
+        </w:numPr>
+        <w:pStyle w:val="Compact"/>
+      </w:pPr>
+      <w:r>
+        <w:rPr>
+          <w:bCs/>
+          <w:b/>
+        </w:rPr>
+        <w:t xml:space="preserve">The same mark-comparison-grid logic is duplicated across two</w:t>
+      </w:r>
+      <w:r>
+        <w:rPr>
+          <w:bCs/>
+          <w:b/>
+        </w:rPr>
+        <w:t xml:space="preserve"> </w:t>
+      </w:r>
+      <w:r>
+        <w:rPr>
+          <w:bCs/>
+          <w:b/>
+        </w:rPr>
+        <w:t xml:space="preserve">separate files</w:t>
+      </w:r>
+      <w:r>
+        <w:t xml:space="preserve"> </w:t>
+      </w:r>
+      <w:r>
+        <w:t xml:space="preserve">—</w:t>
+      </w:r>
+      <w:r>
+        <w:t xml:space="preserve"> </w:t>
+      </w:r>
+      <w:r>
+        <w:rPr>
+          <w:rStyle w:val="VerbatimChar"/>
+        </w:rPr>
+        <w:t xml:space="preserve">chief_mark_view.py</w:t>
+      </w:r>
+      <w:r>
+        <w:t xml:space="preserve">’s</w:t>
+      </w:r>
+      <w:r>
+        <w:t xml:space="preserve"> </w:t>
+      </w:r>
+      <w:r>
+        <w:rPr>
+          <w:rStyle w:val="VerbatimChar"/>
+        </w:rPr>
+        <w:t xml:space="preserve">MarkchiefStudentMarkList</w:t>
+      </w:r>
+      <w:r>
+        <w:t xml:space="preserve">/</w:t>
+      </w:r>
+      <w:r>
+        <w:rPr>
+          <w:rStyle w:val="VerbatimChar"/>
+        </w:rPr>
+        <w:t xml:space="preserve">Fetch</w:t>
+      </w:r>
+      <w:r>
+        <w:t xml:space="preserve"> </w:t>
+      </w:r>
+      <w:r>
+        <w:t xml:space="preserve">and</w:t>
+      </w:r>
+      <w:r>
+        <w:t xml:space="preserve"> </w:t>
+      </w:r>
+      <w:r>
+        <w:rPr>
+          <w:rStyle w:val="VerbatimChar"/>
+        </w:rPr>
+        <w:t xml:space="preserve">mark_approve.py</w:t>
+      </w:r>
+      <w:r>
+        <w:t xml:space="preserve">’s</w:t>
+      </w:r>
+      <w:r>
+        <w:t xml:space="preserve"> </w:t>
+      </w:r>
+      <w:r>
+        <w:rPr>
+          <w:rStyle w:val="VerbatimChar"/>
+        </w:rPr>
+        <w:t xml:space="preserve">MarkUpdateStudentMarkList</w:t>
+      </w:r>
+      <w:r>
+        <w:t xml:space="preserve">/</w:t>
+      </w:r>
+      <w:r>
+        <w:rPr>
+          <w:rStyle w:val="VerbatimChar"/>
+        </w:rPr>
+        <w:t xml:space="preserve">Fetch</w:t>
+      </w:r>
+      <w:r>
+        <w:t xml:space="preserve"> </w:t>
+      </w:r>
+      <w:r>
+        <w:t xml:space="preserve">are ~90% identical code,</w:t>
+      </w:r>
+      <w:r>
+        <w:t xml:space="preserve"> </w:t>
+      </w:r>
+      <w:r>
+        <w:t xml:space="preserve">independently copy-pasted rather than shared. Also resolves an</w:t>
+      </w:r>
+      <w:r>
+        <w:t xml:space="preserve"> </w:t>
+      </w:r>
+      <w:r>
+        <w:t xml:space="preserve">open question from</w:t>
+      </w:r>
+      <w:r>
+        <w:t xml:space="preserve"> </w:t>
+      </w:r>
+      <w:r>
+        <w:rPr>
+          <w:rStyle w:val="VerbatimChar"/>
+        </w:rPr>
+        <w:t xml:space="preserve">chief-mark-view.md</w:t>
+      </w:r>
+      <w:r>
+        <w:t xml:space="preserve">: that file’s endpoints</w:t>
+      </w:r>
+      <w:r>
+        <w:t xml:space="preserve"> </w:t>
+      </w:r>
+      <w:r>
+        <w:t xml:space="preserve">looked read-only because they are – the actual</w:t>
+      </w:r>
+      <w:r>
+        <w:t xml:space="preserve"> </w:t>
+      </w:r>
+      <w:r>
+        <w:t xml:space="preserve">“</w:t>
+      </w:r>
+      <w:r>
+        <w:t xml:space="preserve">update a mark</w:t>
+      </w:r>
+      <w:r>
+        <w:t xml:space="preserve">”</w:t>
+      </w:r>
+      <w:r>
+        <w:t xml:space="preserve"> </w:t>
+      </w:r>
+      <w:r>
+        <w:t xml:space="preserve">action lives in</w:t>
+      </w:r>
+      <w:r>
+        <w:t xml:space="preserve"> </w:t>
+      </w:r>
+      <w:r>
+        <w:rPr>
+          <w:rStyle w:val="VerbatimChar"/>
+        </w:rPr>
+        <w:t xml:space="preserve">mark_approve.py</w:t>
+      </w:r>
+      <w:r>
+        <w:t xml:space="preserve">’s</w:t>
+      </w:r>
+      <w:r>
+        <w:t xml:space="preserve"> </w:t>
+      </w:r>
+      <w:r>
+        <w:rPr>
+          <w:rStyle w:val="VerbatimChar"/>
+        </w:rPr>
+        <w:t xml:space="preserve">MarkUpdateStudentMark</w:t>
+      </w:r>
+      <w:r>
+        <w:t xml:space="preserve"> </w:t>
+      </w:r>
+      <w:r>
+        <w:t xml:space="preserve">instead.</w:t>
+      </w:r>
+    </w:p>
+    <w:p>
+      <w:pPr>
+        <w:numPr>
+          <w:ilvl w:val="0"/>
+          <w:numId w:val="1003"/>
+        </w:numPr>
+        <w:pStyle w:val="Compact"/>
+      </w:pPr>
+      <w:r>
+        <w:rPr>
+          <w:rStyle w:val="VerbatimChar"/>
+        </w:rPr>
+        <w:t xml:space="preserve">data</w:t>
+      </w:r>
+      <w:r>
+        <w:t xml:space="preserve"> </w:t>
+      </w:r>
+      <w:r>
+        <w:rPr>
+          <w:bCs/>
+          <w:b/>
+        </w:rPr>
+        <w:t xml:space="preserve">passed as a raw list instead of an object</w:t>
+      </w:r>
+      <w:r>
+        <w:t xml:space="preserve"> </w:t>
+      </w:r>
+      <w:r>
+        <w:t xml:space="preserve">—</w:t>
+      </w:r>
+      <w:r>
+        <w:t xml:space="preserve"> </w:t>
+      </w:r>
+      <w:r>
+        <w:rPr>
+          <w:rStyle w:val="VerbatimChar"/>
+        </w:rPr>
+        <w:t xml:space="preserve">facingsheet.py</w:t>
+      </w:r>
+      <w:r>
+        <w:t xml:space="preserve">’s</w:t>
+      </w:r>
+      <w:r>
+        <w:t xml:space="preserve"> </w:t>
+      </w:r>
+      <w:r>
+        <w:rPr>
+          <w:rStyle w:val="VerbatimChar"/>
+        </w:rPr>
+        <w:t xml:space="preserve">FacingSheetCampList</w:t>
+      </w:r>
+      <w:r>
+        <w:t xml:space="preserve"> </w:t>
+      </w:r>
+      <w:r>
+        <w:t xml:space="preserve">returns</w:t>
+      </w:r>
+      <w:r>
+        <w:t xml:space="preserve"> </w:t>
+      </w:r>
+      <w:r>
+        <w:rPr>
+          <w:rStyle w:val="VerbatimChar"/>
+        </w:rPr>
+        <w:t xml:space="preserve">data</w:t>
+      </w:r>
+      <w:r>
+        <w:t xml:space="preserve"> </w:t>
+      </w:r>
+      <w:r>
+        <w:t xml:space="preserve">as a bare</w:t>
+      </w:r>
+      <w:r>
+        <w:t xml:space="preserve"> </w:t>
+      </w:r>
+      <w:r>
+        <w:t xml:space="preserve">array rather than</w:t>
+      </w:r>
+      <w:r>
+        <w:t xml:space="preserve"> </w:t>
+      </w:r>
+      <w:r>
+        <w:rPr>
+          <w:rStyle w:val="VerbatimChar"/>
+        </w:rPr>
+        <w:t xml:space="preserve">{"camp_list": [...]}</w:t>
+      </w:r>
+      <w:r>
+        <w:t xml:space="preserve"> </w:t>
+      </w:r>
+      <w:r>
+        <w:t xml:space="preserve">the way every other list</w:t>
+      </w:r>
+      <w:r>
+        <w:t xml:space="preserve"> </w:t>
+      </w:r>
+      <w:r>
+        <w:t xml:space="preserve">endpoint in the module does it.</w:t>
+      </w:r>
+    </w:p>
+    <w:p>
+      <w:pPr>
+        <w:numPr>
+          <w:ilvl w:val="0"/>
+          <w:numId w:val="1003"/>
+        </w:numPr>
+        <w:pStyle w:val="Compact"/>
+      </w:pPr>
+      <w:r>
+        <w:rPr>
+          <w:bCs/>
+          <w:b/>
+        </w:rPr>
+        <w:t xml:space="preserve">A write operation registered as</w:t>
+      </w:r>
+      <w:r>
+        <w:t xml:space="preserve"> </w:t>
+      </w:r>
+      <w:r>
+        <w:rPr>
+          <w:rStyle w:val="VerbatimChar"/>
+        </w:rPr>
+        <w:t xml:space="preserve">GET</w:t>
+      </w:r>
+      <w:r>
+        <w:t xml:space="preserve"> </w:t>
+      </w:r>
+      <w:r>
+        <w:t xml:space="preserve">—</w:t>
+      </w:r>
+      <w:r>
+        <w:t xml:space="preserve"> </w:t>
+      </w:r>
+      <w:r>
+        <w:rPr>
+          <w:rStyle w:val="VerbatimChar"/>
+        </w:rPr>
+        <w:t xml:space="preserve">facingsheet.py</w:t>
+      </w:r>
+      <w:r>
+        <w:t xml:space="preserve">’s</w:t>
+      </w:r>
+      <w:r>
+        <w:t xml:space="preserve"> </w:t>
+      </w:r>
+      <w:r>
+        <w:rPr>
+          <w:rStyle w:val="VerbatimChar"/>
+        </w:rPr>
+        <w:t xml:space="preserve">AdditionalFacingSheet</w:t>
+      </w:r>
+      <w:r>
+        <w:t xml:space="preserve"> </w:t>
+      </w:r>
+      <w:r>
+        <w:t xml:space="preserve">increments a real database counter but is</w:t>
+      </w:r>
+      <w:r>
+        <w:t xml:space="preserve"> </w:t>
+      </w:r>
+      <w:r>
+        <w:t xml:space="preserve">wired up as a</w:t>
+      </w:r>
+      <w:r>
+        <w:t xml:space="preserve"> </w:t>
+      </w:r>
+      <w:r>
+        <w:rPr>
+          <w:rStyle w:val="VerbatimChar"/>
+        </w:rPr>
+        <w:t xml:space="preserve">GET</w:t>
+      </w:r>
+      <w:r>
+        <w:t xml:space="preserve"> </w:t>
+      </w:r>
+      <w:r>
+        <w:t xml:space="preserve">with all its parameters in the query string,</w:t>
+      </w:r>
+      <w:r>
+        <w:t xml:space="preserve"> </w:t>
+      </w:r>
+      <w:r>
+        <w:t xml:space="preserve">unlike every other write in the module.</w:t>
+      </w:r>
+    </w:p>
     <w:p>
       <w:pPr>
         <w:pStyle w:val="BlockText"/>
       </w:pPr>
       <w:r>
-        <w:t xml:space="preserve">This is a living document — sub-areas are being documented one at a time, in the order they appear in the source code, and reviewed before moving to the next.</w:t>
+        <w:t xml:space="preserve">This is a living document — sub-areas are being documented one at a</w:t>
+      </w:r>
+      <w:r>
+        <w:t xml:space="preserve"> </w:t>
+      </w:r>
+      <w:r>
+        <w:t xml:space="preserve">time, in the order they appear in the source code, and reviewed before</w:t>
+      </w:r>
+      <w:r>
+        <w:t xml:space="preserve"> </w:t>
+      </w:r>
+      <w:r>
+        <w:t xml:space="preserve">moving to the next.</w:t>
       </w:r>
     </w:p>
-    <w:bookmarkEnd w:id="22"/>
-    <w:bookmarkEnd w:id="23"/>
+    <w:bookmarkEnd w:id="25"/>
+    <w:bookmarkEnd w:id="26"/>
     <w:sectPr/>
   </w:body>
 </w:document>
@@ -1135,6 +4237,12 @@
     <w:abstractNumId w:val="990"/>
   </w:num>
   <w:num w:numId="1001">
+    <w:abstractNumId w:val="991"/>
+  </w:num>
+  <w:num w:numId="1002">
+    <w:abstractNumId w:val="991"/>
+  </w:num>
+  <w:num w:numId="1003">
     <w:abstractNumId w:val="991"/>
   </w:num>
 </w:numbering>

</xml_diff>